<commit_message>
docs: explain the GDS/NDC fare-description problem FareLens solves
</commit_message>
<xml_diff>
--- a/docs/FareLens.docx
+++ b/docs/FareLens.docx
@@ -17,7 +17,7 @@
           <w:noProof/>
         </w:rPr>
         <w:drawing>
-          <wp:inline distT="0" distB="0" distL="0" distR="0" wp14:anchorId="5C9AEEFA" wp14:editId="3ECEC47D">
+          <wp:inline distT="0" distB="0" distL="0" distR="0" wp14:anchorId="057C7575" wp14:editId="12B2B5A4">
             <wp:extent cx="1905000" cy="266700"/>
             <wp:effectExtent l="0" t="0" r="0" b="0"/>
             <wp:docPr id="1" name="Picture 1"/>
@@ -180,7 +180,7 @@
     <w:sdt>
       <w:sdtPr>
         <w:alias w:val="Contents"/>
-        <w:id w:val="2110845836"/>
+        <w:id w:val="-1575727786"/>
       </w:sdtPr>
       <w:sdtEndPr/>
       <w:sdtContent>
@@ -209,7 +209,7 @@
           <w:r>
             <w:fldChar w:fldCharType="separate"/>
           </w:r>
-          <w:hyperlink w:anchor="_Toc240999879" w:history="1">
+          <w:hyperlink w:anchor="_Toc241000364" w:history="1">
             <w:r>
               <w:rPr>
                 <w:rStyle w:val="Hyperlink"/>
@@ -233,7 +233,7 @@
               <w:rPr>
                 <w:noProof/>
               </w:rPr>
-              <w:instrText xml:space="preserve"> PAGEREF _Toc240999879 \h </w:instrText>
+              <w:instrText xml:space="preserve"> PAGEREF _Toc241000364 \h </w:instrText>
             </w:r>
             <w:r>
               <w:rPr>
@@ -276,7 +276,7 @@
               <w14:ligatures w14:val="standardContextual"/>
             </w:rPr>
           </w:pPr>
-          <w:hyperlink w:anchor="_Toc240999880" w:history="1">
+          <w:hyperlink w:anchor="_Toc241000365" w:history="1">
             <w:r>
               <w:rPr>
                 <w:rStyle w:val="Hyperlink"/>
@@ -300,7 +300,7 @@
               <w:rPr>
                 <w:noProof/>
               </w:rPr>
-              <w:instrText xml:space="preserve"> PAGEREF _Toc240999880 \h </w:instrText>
+              <w:instrText xml:space="preserve"> PAGEREF _Toc241000365 \h </w:instrText>
             </w:r>
             <w:r>
               <w:rPr>
@@ -343,7 +343,7 @@
               <w14:ligatures w14:val="standardContextual"/>
             </w:rPr>
           </w:pPr>
-          <w:hyperlink w:anchor="_Toc240999881" w:history="1">
+          <w:hyperlink w:anchor="_Toc241000366" w:history="1">
             <w:r>
               <w:rPr>
                 <w:rStyle w:val="Hyperlink"/>
@@ -367,7 +367,7 @@
               <w:rPr>
                 <w:noProof/>
               </w:rPr>
-              <w:instrText xml:space="preserve"> PAGEREF _Toc240999881 \h </w:instrText>
+              <w:instrText xml:space="preserve"> PAGEREF _Toc241000366 \h </w:instrText>
             </w:r>
             <w:r>
               <w:rPr>
@@ -410,7 +410,7 @@
               <w14:ligatures w14:val="standardContextual"/>
             </w:rPr>
           </w:pPr>
-          <w:hyperlink w:anchor="_Toc240999882" w:history="1">
+          <w:hyperlink w:anchor="_Toc241000367" w:history="1">
             <w:r>
               <w:rPr>
                 <w:rStyle w:val="Hyperlink"/>
@@ -434,7 +434,7 @@
               <w:rPr>
                 <w:noProof/>
               </w:rPr>
-              <w:instrText xml:space="preserve"> PAGEREF _Toc240999882 \h </w:instrText>
+              <w:instrText xml:space="preserve"> PAGEREF _Toc241000367 \h </w:instrText>
             </w:r>
             <w:r>
               <w:rPr>
@@ -477,7 +477,7 @@
               <w14:ligatures w14:val="standardContextual"/>
             </w:rPr>
           </w:pPr>
-          <w:hyperlink w:anchor="_Toc240999883" w:history="1">
+          <w:hyperlink w:anchor="_Toc241000368" w:history="1">
             <w:r>
               <w:rPr>
                 <w:rStyle w:val="Hyperlink"/>
@@ -501,7 +501,7 @@
               <w:rPr>
                 <w:noProof/>
               </w:rPr>
-              <w:instrText xml:space="preserve"> PAGEREF _Toc240999883 \h </w:instrText>
+              <w:instrText xml:space="preserve"> PAGEREF _Toc241000368 \h </w:instrText>
             </w:r>
             <w:r>
               <w:rPr>
@@ -544,7 +544,7 @@
               <w14:ligatures w14:val="standardContextual"/>
             </w:rPr>
           </w:pPr>
-          <w:hyperlink w:anchor="_Toc240999884" w:history="1">
+          <w:hyperlink w:anchor="_Toc241000369" w:history="1">
             <w:r>
               <w:rPr>
                 <w:rStyle w:val="Hyperlink"/>
@@ -568,7 +568,7 @@
               <w:rPr>
                 <w:noProof/>
               </w:rPr>
-              <w:instrText xml:space="preserve"> PAGEREF _Toc240999884 \h </w:instrText>
+              <w:instrText xml:space="preserve"> PAGEREF _Toc241000369 \h </w:instrText>
             </w:r>
             <w:r>
               <w:rPr>
@@ -611,7 +611,7 @@
               <w14:ligatures w14:val="standardContextual"/>
             </w:rPr>
           </w:pPr>
-          <w:hyperlink w:anchor="_Toc240999885" w:history="1">
+          <w:hyperlink w:anchor="_Toc241000370" w:history="1">
             <w:r>
               <w:rPr>
                 <w:rStyle w:val="Hyperlink"/>
@@ -635,7 +635,7 @@
               <w:rPr>
                 <w:noProof/>
               </w:rPr>
-              <w:instrText xml:space="preserve"> PAGEREF _Toc240999885 \h </w:instrText>
+              <w:instrText xml:space="preserve"> PAGEREF _Toc241000370 \h </w:instrText>
             </w:r>
             <w:r>
               <w:rPr>
@@ -678,7 +678,7 @@
               <w14:ligatures w14:val="standardContextual"/>
             </w:rPr>
           </w:pPr>
-          <w:hyperlink w:anchor="_Toc240999886" w:history="1">
+          <w:hyperlink w:anchor="_Toc241000371" w:history="1">
             <w:r>
               <w:rPr>
                 <w:rStyle w:val="Hyperlink"/>
@@ -702,7 +702,7 @@
               <w:rPr>
                 <w:noProof/>
               </w:rPr>
-              <w:instrText xml:space="preserve"> PAGEREF _Toc240999886 \h </w:instrText>
+              <w:instrText xml:space="preserve"> PAGEREF _Toc241000371 \h </w:instrText>
             </w:r>
             <w:r>
               <w:rPr>
@@ -745,7 +745,7 @@
               <w14:ligatures w14:val="standardContextual"/>
             </w:rPr>
           </w:pPr>
-          <w:hyperlink w:anchor="_Toc240999887" w:history="1">
+          <w:hyperlink w:anchor="_Toc241000372" w:history="1">
             <w:r>
               <w:rPr>
                 <w:rStyle w:val="Hyperlink"/>
@@ -769,7 +769,7 @@
               <w:rPr>
                 <w:noProof/>
               </w:rPr>
-              <w:instrText xml:space="preserve"> PAGEREF _Toc240999887 \h </w:instrText>
+              <w:instrText xml:space="preserve"> PAGEREF _Toc241000372 \h </w:instrText>
             </w:r>
             <w:r>
               <w:rPr>
@@ -812,7 +812,7 @@
               <w14:ligatures w14:val="standardContextual"/>
             </w:rPr>
           </w:pPr>
-          <w:hyperlink w:anchor="_Toc240999888" w:history="1">
+          <w:hyperlink w:anchor="_Toc241000373" w:history="1">
             <w:r>
               <w:rPr>
                 <w:rStyle w:val="Hyperlink"/>
@@ -836,7 +836,7 @@
               <w:rPr>
                 <w:noProof/>
               </w:rPr>
-              <w:instrText xml:space="preserve"> PAGEREF _Toc240999888 \h </w:instrText>
+              <w:instrText xml:space="preserve"> PAGEREF _Toc241000373 \h </w:instrText>
             </w:r>
             <w:r>
               <w:rPr>
@@ -879,7 +879,7 @@
               <w14:ligatures w14:val="standardContextual"/>
             </w:rPr>
           </w:pPr>
-          <w:hyperlink w:anchor="_Toc240999889" w:history="1">
+          <w:hyperlink w:anchor="_Toc241000374" w:history="1">
             <w:r>
               <w:rPr>
                 <w:rStyle w:val="Hyperlink"/>
@@ -903,7 +903,7 @@
               <w:rPr>
                 <w:noProof/>
               </w:rPr>
-              <w:instrText xml:space="preserve"> PAGEREF _Toc240999889 \h </w:instrText>
+              <w:instrText xml:space="preserve"> PAGEREF _Toc241000374 \h </w:instrText>
             </w:r>
             <w:r>
               <w:rPr>
@@ -946,7 +946,7 @@
               <w14:ligatures w14:val="standardContextual"/>
             </w:rPr>
           </w:pPr>
-          <w:hyperlink w:anchor="_Toc240999890" w:history="1">
+          <w:hyperlink w:anchor="_Toc241000375" w:history="1">
             <w:r>
               <w:rPr>
                 <w:rStyle w:val="Hyperlink"/>
@@ -970,7 +970,7 @@
               <w:rPr>
                 <w:noProof/>
               </w:rPr>
-              <w:instrText xml:space="preserve"> PAGEREF _Toc240999890 \h </w:instrText>
+              <w:instrText xml:space="preserve"> PAGEREF _Toc241000375 \h </w:instrText>
             </w:r>
             <w:r>
               <w:rPr>
@@ -1013,7 +1013,7 @@
               <w14:ligatures w14:val="standardContextual"/>
             </w:rPr>
           </w:pPr>
-          <w:hyperlink w:anchor="_Toc240999891" w:history="1">
+          <w:hyperlink w:anchor="_Toc241000376" w:history="1">
             <w:r>
               <w:rPr>
                 <w:rStyle w:val="Hyperlink"/>
@@ -1037,7 +1037,7 @@
               <w:rPr>
                 <w:noProof/>
               </w:rPr>
-              <w:instrText xml:space="preserve"> PAGEREF _Toc240999891 \h </w:instrText>
+              <w:instrText xml:space="preserve"> PAGEREF _Toc241000376 \h </w:instrText>
             </w:r>
             <w:r>
               <w:rPr>
@@ -1080,7 +1080,7 @@
               <w14:ligatures w14:val="standardContextual"/>
             </w:rPr>
           </w:pPr>
-          <w:hyperlink w:anchor="_Toc240999892" w:history="1">
+          <w:hyperlink w:anchor="_Toc241000377" w:history="1">
             <w:r>
               <w:rPr>
                 <w:rStyle w:val="Hyperlink"/>
@@ -1104,7 +1104,7 @@
               <w:rPr>
                 <w:noProof/>
               </w:rPr>
-              <w:instrText xml:space="preserve"> PAGEREF _Toc240999892 \h </w:instrText>
+              <w:instrText xml:space="preserve"> PAGEREF _Toc241000377 \h </w:instrText>
             </w:r>
             <w:r>
               <w:rPr>
@@ -1147,7 +1147,7 @@
               <w14:ligatures w14:val="standardContextual"/>
             </w:rPr>
           </w:pPr>
-          <w:hyperlink w:anchor="_Toc240999893" w:history="1">
+          <w:hyperlink w:anchor="_Toc241000378" w:history="1">
             <w:r>
               <w:rPr>
                 <w:rStyle w:val="Hyperlink"/>
@@ -1171,7 +1171,7 @@
               <w:rPr>
                 <w:noProof/>
               </w:rPr>
-              <w:instrText xml:space="preserve"> PAGEREF _Toc240999893 \h </w:instrText>
+              <w:instrText xml:space="preserve"> PAGEREF _Toc241000378 \h </w:instrText>
             </w:r>
             <w:r>
               <w:rPr>
@@ -1214,7 +1214,7 @@
               <w14:ligatures w14:val="standardContextual"/>
             </w:rPr>
           </w:pPr>
-          <w:hyperlink w:anchor="_Toc240999894" w:history="1">
+          <w:hyperlink w:anchor="_Toc241000379" w:history="1">
             <w:r>
               <w:rPr>
                 <w:rStyle w:val="Hyperlink"/>
@@ -1238,7 +1238,7 @@
               <w:rPr>
                 <w:noProof/>
               </w:rPr>
-              <w:instrText xml:space="preserve"> PAGEREF _Toc240999894 \h </w:instrText>
+              <w:instrText xml:space="preserve"> PAGEREF _Toc241000379 \h </w:instrText>
             </w:r>
             <w:r>
               <w:rPr>
@@ -1281,7 +1281,7 @@
               <w14:ligatures w14:val="standardContextual"/>
             </w:rPr>
           </w:pPr>
-          <w:hyperlink w:anchor="_Toc240999895" w:history="1">
+          <w:hyperlink w:anchor="_Toc241000380" w:history="1">
             <w:r>
               <w:rPr>
                 <w:rStyle w:val="Hyperlink"/>
@@ -1305,7 +1305,7 @@
               <w:rPr>
                 <w:noProof/>
               </w:rPr>
-              <w:instrText xml:space="preserve"> PAGEREF _Toc240999895 \h </w:instrText>
+              <w:instrText xml:space="preserve"> PAGEREF _Toc241000380 \h </w:instrText>
             </w:r>
             <w:r>
               <w:rPr>
@@ -1348,7 +1348,7 @@
               <w14:ligatures w14:val="standardContextual"/>
             </w:rPr>
           </w:pPr>
-          <w:hyperlink w:anchor="_Toc240999896" w:history="1">
+          <w:hyperlink w:anchor="_Toc241000381" w:history="1">
             <w:r>
               <w:rPr>
                 <w:rStyle w:val="Hyperlink"/>
@@ -1372,7 +1372,7 @@
               <w:rPr>
                 <w:noProof/>
               </w:rPr>
-              <w:instrText xml:space="preserve"> PAGEREF _Toc240999896 \h </w:instrText>
+              <w:instrText xml:space="preserve"> PAGEREF _Toc241000381 \h </w:instrText>
             </w:r>
             <w:r>
               <w:rPr>
@@ -1415,7 +1415,7 @@
               <w14:ligatures w14:val="standardContextual"/>
             </w:rPr>
           </w:pPr>
-          <w:hyperlink w:anchor="_Toc240999897" w:history="1">
+          <w:hyperlink w:anchor="_Toc241000382" w:history="1">
             <w:r>
               <w:rPr>
                 <w:rStyle w:val="Hyperlink"/>
@@ -1439,7 +1439,7 @@
               <w:rPr>
                 <w:noProof/>
               </w:rPr>
-              <w:instrText xml:space="preserve"> PAGEREF _Toc240999897 \h </w:instrText>
+              <w:instrText xml:space="preserve"> PAGEREF _Toc241000382 \h </w:instrText>
             </w:r>
             <w:r>
               <w:rPr>
@@ -1482,7 +1482,7 @@
               <w14:ligatures w14:val="standardContextual"/>
             </w:rPr>
           </w:pPr>
-          <w:hyperlink w:anchor="_Toc240999898" w:history="1">
+          <w:hyperlink w:anchor="_Toc241000383" w:history="1">
             <w:r>
               <w:rPr>
                 <w:rStyle w:val="Hyperlink"/>
@@ -1506,7 +1506,7 @@
               <w:rPr>
                 <w:noProof/>
               </w:rPr>
-              <w:instrText xml:space="preserve"> PAGEREF _Toc240999898 \h </w:instrText>
+              <w:instrText xml:space="preserve"> PAGEREF _Toc241000383 \h </w:instrText>
             </w:r>
             <w:r>
               <w:rPr>
@@ -1549,7 +1549,7 @@
               <w14:ligatures w14:val="standardContextual"/>
             </w:rPr>
           </w:pPr>
-          <w:hyperlink w:anchor="_Toc240999899" w:history="1">
+          <w:hyperlink w:anchor="_Toc241000384" w:history="1">
             <w:r>
               <w:rPr>
                 <w:rStyle w:val="Hyperlink"/>
@@ -1573,7 +1573,7 @@
               <w:rPr>
                 <w:noProof/>
               </w:rPr>
-              <w:instrText xml:space="preserve"> PAGEREF _Toc240999899 \h </w:instrText>
+              <w:instrText xml:space="preserve"> PAGEREF _Toc241000384 \h </w:instrText>
             </w:r>
             <w:r>
               <w:rPr>
@@ -1616,7 +1616,7 @@
               <w14:ligatures w14:val="standardContextual"/>
             </w:rPr>
           </w:pPr>
-          <w:hyperlink w:anchor="_Toc240999900" w:history="1">
+          <w:hyperlink w:anchor="_Toc241000385" w:history="1">
             <w:r>
               <w:rPr>
                 <w:rStyle w:val="Hyperlink"/>
@@ -1640,7 +1640,7 @@
               <w:rPr>
                 <w:noProof/>
               </w:rPr>
-              <w:instrText xml:space="preserve"> PAGEREF _Toc240999900 \h </w:instrText>
+              <w:instrText xml:space="preserve"> PAGEREF _Toc241000385 \h </w:instrText>
             </w:r>
             <w:r>
               <w:rPr>
@@ -1683,7 +1683,7 @@
               <w14:ligatures w14:val="standardContextual"/>
             </w:rPr>
           </w:pPr>
-          <w:hyperlink w:anchor="_Toc240999901" w:history="1">
+          <w:hyperlink w:anchor="_Toc241000386" w:history="1">
             <w:r>
               <w:rPr>
                 <w:rStyle w:val="Hyperlink"/>
@@ -1707,7 +1707,7 @@
               <w:rPr>
                 <w:noProof/>
               </w:rPr>
-              <w:instrText xml:space="preserve"> PAGEREF _Toc240999901 \h </w:instrText>
+              <w:instrText xml:space="preserve"> PAGEREF _Toc241000386 \h </w:instrText>
             </w:r>
             <w:r>
               <w:rPr>
@@ -1750,7 +1750,7 @@
               <w14:ligatures w14:val="standardContextual"/>
             </w:rPr>
           </w:pPr>
-          <w:hyperlink w:anchor="_Toc240999902" w:history="1">
+          <w:hyperlink w:anchor="_Toc241000387" w:history="1">
             <w:r>
               <w:rPr>
                 <w:rStyle w:val="Hyperlink"/>
@@ -1774,7 +1774,7 @@
               <w:rPr>
                 <w:noProof/>
               </w:rPr>
-              <w:instrText xml:space="preserve"> PAGEREF _Toc240999902 \h </w:instrText>
+              <w:instrText xml:space="preserve"> PAGEREF _Toc241000387 \h </w:instrText>
             </w:r>
             <w:r>
               <w:rPr>
@@ -1817,7 +1817,7 @@
               <w14:ligatures w14:val="standardContextual"/>
             </w:rPr>
           </w:pPr>
-          <w:hyperlink w:anchor="_Toc240999903" w:history="1">
+          <w:hyperlink w:anchor="_Toc241000388" w:history="1">
             <w:r>
               <w:rPr>
                 <w:rStyle w:val="Hyperlink"/>
@@ -1841,7 +1841,7 @@
               <w:rPr>
                 <w:noProof/>
               </w:rPr>
-              <w:instrText xml:space="preserve"> PAGEREF _Toc240999903 \h </w:instrText>
+              <w:instrText xml:space="preserve"> PAGEREF _Toc241000388 \h </w:instrText>
             </w:r>
             <w:r>
               <w:rPr>
@@ -1884,7 +1884,7 @@
               <w14:ligatures w14:val="standardContextual"/>
             </w:rPr>
           </w:pPr>
-          <w:hyperlink w:anchor="_Toc240999904" w:history="1">
+          <w:hyperlink w:anchor="_Toc241000389" w:history="1">
             <w:r>
               <w:rPr>
                 <w:rStyle w:val="Hyperlink"/>
@@ -1908,7 +1908,7 @@
               <w:rPr>
                 <w:noProof/>
               </w:rPr>
-              <w:instrText xml:space="preserve"> PAGEREF _Toc240999904 \h </w:instrText>
+              <w:instrText xml:space="preserve"> PAGEREF _Toc241000389 \h </w:instrText>
             </w:r>
             <w:r>
               <w:rPr>
@@ -1951,7 +1951,7 @@
               <w14:ligatures w14:val="standardContextual"/>
             </w:rPr>
           </w:pPr>
-          <w:hyperlink w:anchor="_Toc240999905" w:history="1">
+          <w:hyperlink w:anchor="_Toc241000390" w:history="1">
             <w:r>
               <w:rPr>
                 <w:rStyle w:val="Hyperlink"/>
@@ -1975,7 +1975,7 @@
               <w:rPr>
                 <w:noProof/>
               </w:rPr>
-              <w:instrText xml:space="preserve"> PAGEREF _Toc240999905 \h </w:instrText>
+              <w:instrText xml:space="preserve"> PAGEREF _Toc241000390 \h </w:instrText>
             </w:r>
             <w:r>
               <w:rPr>
@@ -2018,7 +2018,7 @@
               <w14:ligatures w14:val="standardContextual"/>
             </w:rPr>
           </w:pPr>
-          <w:hyperlink w:anchor="_Toc240999906" w:history="1">
+          <w:hyperlink w:anchor="_Toc241000391" w:history="1">
             <w:r>
               <w:rPr>
                 <w:rStyle w:val="Hyperlink"/>
@@ -2042,7 +2042,7 @@
               <w:rPr>
                 <w:noProof/>
               </w:rPr>
-              <w:instrText xml:space="preserve"> PAGEREF _Toc240999906 \h </w:instrText>
+              <w:instrText xml:space="preserve"> PAGEREF _Toc241000391 \h </w:instrText>
             </w:r>
             <w:r>
               <w:rPr>
@@ -2085,7 +2085,7 @@
               <w14:ligatures w14:val="standardContextual"/>
             </w:rPr>
           </w:pPr>
-          <w:hyperlink w:anchor="_Toc240999907" w:history="1">
+          <w:hyperlink w:anchor="_Toc241000392" w:history="1">
             <w:r>
               <w:rPr>
                 <w:rStyle w:val="Hyperlink"/>
@@ -2109,7 +2109,7 @@
               <w:rPr>
                 <w:noProof/>
               </w:rPr>
-              <w:instrText xml:space="preserve"> PAGEREF _Toc240999907 \h </w:instrText>
+              <w:instrText xml:space="preserve"> PAGEREF _Toc241000392 \h </w:instrText>
             </w:r>
             <w:r>
               <w:rPr>
@@ -2152,7 +2152,7 @@
               <w14:ligatures w14:val="standardContextual"/>
             </w:rPr>
           </w:pPr>
-          <w:hyperlink w:anchor="_Toc240999908" w:history="1">
+          <w:hyperlink w:anchor="_Toc241000393" w:history="1">
             <w:r>
               <w:rPr>
                 <w:rStyle w:val="Hyperlink"/>
@@ -2176,7 +2176,7 @@
               <w:rPr>
                 <w:noProof/>
               </w:rPr>
-              <w:instrText xml:space="preserve"> PAGEREF _Toc240999908 \h </w:instrText>
+              <w:instrText xml:space="preserve"> PAGEREF _Toc241000393 \h </w:instrText>
             </w:r>
             <w:r>
               <w:rPr>
@@ -2219,7 +2219,7 @@
               <w14:ligatures w14:val="standardContextual"/>
             </w:rPr>
           </w:pPr>
-          <w:hyperlink w:anchor="_Toc240999909" w:history="1">
+          <w:hyperlink w:anchor="_Toc241000394" w:history="1">
             <w:r>
               <w:rPr>
                 <w:rStyle w:val="Hyperlink"/>
@@ -2243,7 +2243,7 @@
               <w:rPr>
                 <w:noProof/>
               </w:rPr>
-              <w:instrText xml:space="preserve"> PAGEREF _Toc240999909 \h </w:instrText>
+              <w:instrText xml:space="preserve"> PAGEREF _Toc241000394 \h </w:instrText>
             </w:r>
             <w:r>
               <w:rPr>
@@ -2286,7 +2286,7 @@
               <w14:ligatures w14:val="standardContextual"/>
             </w:rPr>
           </w:pPr>
-          <w:hyperlink w:anchor="_Toc240999910" w:history="1">
+          <w:hyperlink w:anchor="_Toc241000395" w:history="1">
             <w:r>
               <w:rPr>
                 <w:rStyle w:val="Hyperlink"/>
@@ -2310,7 +2310,7 @@
               <w:rPr>
                 <w:noProof/>
               </w:rPr>
-              <w:instrText xml:space="preserve"> PAGEREF _Toc240999910 \h </w:instrText>
+              <w:instrText xml:space="preserve"> PAGEREF _Toc241000395 \h </w:instrText>
             </w:r>
             <w:r>
               <w:rPr>
@@ -2350,7 +2350,7 @@
         <w:keepNext/>
         <w:pageBreakBefore/>
       </w:pPr>
-      <w:bookmarkStart w:id="0" w:name="_Toc240999879"/>
+      <w:bookmarkStart w:id="0" w:name="_Toc241000364"/>
       <w:r>
         <w:lastRenderedPageBreak/>
         <w:t>1. Introduction</w:t>
@@ -2362,7 +2362,7 @@
         <w:pStyle w:val="Heading2"/>
         <w:keepNext/>
       </w:pPr>
-      <w:bookmarkStart w:id="1" w:name="_Toc240999880"/>
+      <w:bookmarkStart w:id="1" w:name="_Toc241000365"/>
       <w:r>
         <w:t>1.1 Why FareLens</w:t>
       </w:r>
@@ -2448,10 +2448,38 @@
     </w:p>
     <w:p>
       <w:pPr>
+        <w:pStyle w:val="Heading3"/>
+        <w:keepNext/>
+      </w:pPr>
+      <w:r>
+        <w:t>The problem this solves for GDS / NDC integrators</w:t>
+      </w:r>
+    </w:p>
+    <w:p>
+      <w:pPr>
+        <w:spacing w:after="120"/>
+      </w:pPr>
+      <w:r>
+        <w:t xml:space="preserve">If you consume airline content through a GDS (TravelSwitch runs on Amadeus) you will have met this: in NDC flows the fare-family / price-class descriptions and fare rules are passed through exactly as the airline supplies them. There is no GDS-generated short text (unlike EDIFACT), no parameter to control the length, and no standardisation across carriers. The result is long, inconsistent text blocks, often with detailed conditions or URLs embedded, that are unusable in a B2C booking flow. When raised with </w:t>
+      </w:r>
+      <w:r>
+        <w:t>the GDS, the position is that this behaviour is by design and compliant with the NDC standard, which means the integrator has to solve it.</w:t>
+      </w:r>
+    </w:p>
+    <w:p>
+      <w:pPr>
+        <w:spacing w:after="120"/>
+      </w:pPr>
+      <w:r>
+        <w:t>FareLens is that solution: feed it whatever the airline returned and get back a consistent, short, structured summary, plus a Q&amp;A channel for the follow-up questions travellers actually ask. It is content-source agnostic: Amadeus, Sabre, Travelport, direct-connect NDC or an airline API all produce the same clean output.</w:t>
+      </w:r>
+    </w:p>
+    <w:p>
+      <w:pPr>
         <w:pStyle w:val="Heading2"/>
         <w:keepNext/>
       </w:pPr>
-      <w:bookmarkStart w:id="2" w:name="_Toc240999881"/>
+      <w:bookmarkStart w:id="2" w:name="_Toc241000366"/>
       <w:r>
         <w:t>1.2 What you get</w:t>
       </w:r>
@@ -2994,7 +3022,7 @@
         <w:pStyle w:val="Heading2"/>
         <w:keepNext/>
       </w:pPr>
-      <w:bookmarkStart w:id="3" w:name="_Toc240999882"/>
+      <w:bookmarkStart w:id="3" w:name="_Toc241000367"/>
       <w:r>
         <w:lastRenderedPageBreak/>
         <w:t>1.3 The admin interface at a glance</w:t>
@@ -3012,10 +3040,10 @@
           <w:noProof/>
         </w:rPr>
         <w:drawing>
-          <wp:inline distT="0" distB="0" distL="0" distR="0" wp14:anchorId="1D54B6D2" wp14:editId="55F64DBC">
+          <wp:inline distT="0" distB="0" distL="0" distR="0" wp14:anchorId="6CEF0787" wp14:editId="2900B3AA">
             <wp:extent cx="6400800" cy="4000500"/>
             <wp:effectExtent l="0" t="0" r="0" b="0"/>
-            <wp:docPr id="1078037657" name="Picture 1078037657"/>
+            <wp:docPr id="599935438" name="Picture 599935438"/>
             <wp:cNvGraphicFramePr>
               <a:graphicFrameLocks xmlns:a="http://schemas.openxmlformats.org/drawingml/2006/main" noChangeAspect="1"/>
             </wp:cNvGraphicFramePr>
@@ -3073,7 +3101,7 @@
         <w:keepNext/>
         <w:pageBreakBefore/>
       </w:pPr>
-      <w:bookmarkStart w:id="4" w:name="_Toc240999883"/>
+      <w:bookmarkStart w:id="4" w:name="_Toc241000368"/>
       <w:r>
         <w:lastRenderedPageBreak/>
         <w:t>2. Quick start</w:t>
@@ -3093,7 +3121,7 @@
         <w:pStyle w:val="Heading2"/>
         <w:keepNext/>
       </w:pPr>
-      <w:bookmarkStart w:id="5" w:name="_Toc240999884"/>
+      <w:bookmarkStart w:id="5" w:name="_Toc241000369"/>
       <w:r>
         <w:t>2.1 Run it</w:t>
       </w:r>
@@ -3198,7 +3226,7 @@
         <w:pStyle w:val="Heading2"/>
         <w:keepNext/>
       </w:pPr>
-      <w:bookmarkStart w:id="6" w:name="_Toc240999885"/>
+      <w:bookmarkStart w:id="6" w:name="_Toc241000370"/>
       <w:r>
         <w:t>2.2 Choose an LLM provider</w:t>
       </w:r>
@@ -3243,10 +3271,10 @@
           <w:noProof/>
         </w:rPr>
         <w:drawing>
-          <wp:inline distT="0" distB="0" distL="0" distR="0" wp14:anchorId="65110F05" wp14:editId="5A7A17F8">
+          <wp:inline distT="0" distB="0" distL="0" distR="0" wp14:anchorId="1AF950B5" wp14:editId="699A0253">
             <wp:extent cx="6400800" cy="4000500"/>
             <wp:effectExtent l="0" t="0" r="0" b="0"/>
-            <wp:docPr id="1690274815" name="Picture 1690274815"/>
+            <wp:docPr id="571140641" name="Picture 571140641"/>
             <wp:cNvGraphicFramePr>
               <a:graphicFrameLocks xmlns:a="http://schemas.openxmlformats.org/drawingml/2006/main" noChangeAspect="1"/>
             </wp:cNvGraphicFramePr>
@@ -3303,7 +3331,7 @@
         <w:pStyle w:val="Heading2"/>
         <w:keepNext/>
       </w:pPr>
-      <w:bookmarkStart w:id="7" w:name="_Toc240999886"/>
+      <w:bookmarkStart w:id="7" w:name="_Toc241000371"/>
       <w:r>
         <w:t>2.3 Create an API key</w:t>
       </w:r>
@@ -3329,10 +3357,10 @@
         </w:rPr>
         <w:lastRenderedPageBreak/>
         <w:drawing>
-          <wp:inline distT="0" distB="0" distL="0" distR="0" wp14:anchorId="18F6672D" wp14:editId="3FE0FA45">
+          <wp:inline distT="0" distB="0" distL="0" distR="0" wp14:anchorId="54580A6F" wp14:editId="50952DD3">
             <wp:extent cx="6400800" cy="4000500"/>
             <wp:effectExtent l="0" t="0" r="0" b="0"/>
-            <wp:docPr id="1059830589" name="Picture 1059830589"/>
+            <wp:docPr id="1768694640" name="Picture 1768694640"/>
             <wp:cNvGraphicFramePr>
               <a:graphicFrameLocks xmlns:a="http://schemas.openxmlformats.org/drawingml/2006/main" noChangeAspect="1"/>
             </wp:cNvGraphicFramePr>
@@ -3389,7 +3417,7 @@
         <w:pStyle w:val="Heading2"/>
         <w:keepNext/>
       </w:pPr>
-      <w:bookmarkStart w:id="8" w:name="_Toc240999887"/>
+      <w:bookmarkStart w:id="8" w:name="_Toc241000372"/>
       <w:r>
         <w:t>2.4 Call the API</w:t>
       </w:r>
@@ -3483,7 +3511,7 @@
         <w:pStyle w:val="Heading2"/>
         <w:keepNext/>
       </w:pPr>
-      <w:bookmarkStart w:id="9" w:name="_Toc240999888"/>
+      <w:bookmarkStart w:id="9" w:name="_Toc241000373"/>
       <w:r>
         <w:t>2.5 Try it in the Playground</w:t>
       </w:r>
@@ -3509,10 +3537,10 @@
         </w:rPr>
         <w:lastRenderedPageBreak/>
         <w:drawing>
-          <wp:inline distT="0" distB="0" distL="0" distR="0" wp14:anchorId="34EE0980" wp14:editId="2AEF4493">
+          <wp:inline distT="0" distB="0" distL="0" distR="0" wp14:anchorId="060BC7E8" wp14:editId="0D00B101">
             <wp:extent cx="6400800" cy="4000500"/>
             <wp:effectExtent l="0" t="0" r="0" b="0"/>
-            <wp:docPr id="1148722089" name="Picture 1148722089"/>
+            <wp:docPr id="1736373260" name="Picture 1736373260"/>
             <wp:cNvGraphicFramePr>
               <a:graphicFrameLocks xmlns:a="http://schemas.openxmlformats.org/drawingml/2006/main" noChangeAspect="1"/>
             </wp:cNvGraphicFramePr>
@@ -3575,10 +3603,10 @@
           <w:noProof/>
         </w:rPr>
         <w:drawing>
-          <wp:inline distT="0" distB="0" distL="0" distR="0" wp14:anchorId="38268369" wp14:editId="388C1BFA">
+          <wp:inline distT="0" distB="0" distL="0" distR="0" wp14:anchorId="6E931CCC" wp14:editId="1CC4A91C">
             <wp:extent cx="6400800" cy="4000500"/>
             <wp:effectExtent l="0" t="0" r="0" b="0"/>
-            <wp:docPr id="51045283" name="Picture 51045283"/>
+            <wp:docPr id="1448665575" name="Picture 1448665575"/>
             <wp:cNvGraphicFramePr>
               <a:graphicFrameLocks xmlns:a="http://schemas.openxmlformats.org/drawingml/2006/main" noChangeAspect="1"/>
             </wp:cNvGraphicFramePr>
@@ -3635,7 +3663,7 @@
         <w:pStyle w:val="Heading2"/>
         <w:keepNext/>
       </w:pPr>
-      <w:bookmarkStart w:id="10" w:name="_Toc240999889"/>
+      <w:bookmarkStart w:id="10" w:name="_Toc241000374"/>
       <w:r>
         <w:lastRenderedPageBreak/>
         <w:t>2.6 Watch usage</w:t>
@@ -3661,10 +3689,10 @@
           <w:noProof/>
         </w:rPr>
         <w:drawing>
-          <wp:inline distT="0" distB="0" distL="0" distR="0" wp14:anchorId="721A0E93" wp14:editId="6CAE058D">
+          <wp:inline distT="0" distB="0" distL="0" distR="0" wp14:anchorId="3F985955" wp14:editId="52A7FAA1">
             <wp:extent cx="6400800" cy="6143625"/>
             <wp:effectExtent l="0" t="0" r="0" b="0"/>
-            <wp:docPr id="408736492" name="Picture 408736492"/>
+            <wp:docPr id="1144019833" name="Picture 1144019833"/>
             <wp:cNvGraphicFramePr>
               <a:graphicFrameLocks xmlns:a="http://schemas.openxmlformats.org/drawingml/2006/main" noChangeAspect="1"/>
             </wp:cNvGraphicFramePr>
@@ -3722,7 +3750,7 @@
         <w:keepNext/>
         <w:pageBreakBefore/>
       </w:pPr>
-      <w:bookmarkStart w:id="11" w:name="_Toc240999890"/>
+      <w:bookmarkStart w:id="11" w:name="_Toc241000375"/>
       <w:r>
         <w:lastRenderedPageBreak/>
         <w:t>3. API reference</w:t>
@@ -3734,7 +3762,7 @@
         <w:pStyle w:val="Heading2"/>
         <w:keepNext/>
       </w:pPr>
-      <w:bookmarkStart w:id="12" w:name="_Toc240999891"/>
+      <w:bookmarkStart w:id="12" w:name="_Toc241000376"/>
       <w:r>
         <w:t>3.1 Authentication and errors</w:t>
       </w:r>
@@ -4442,7 +4470,7 @@
         <w:pStyle w:val="Heading2"/>
         <w:keepNext/>
       </w:pPr>
-      <w:bookmarkStart w:id="13" w:name="_Toc240999892"/>
+      <w:bookmarkStart w:id="13" w:name="_Toc241000377"/>
       <w:r>
         <w:t>3.2 POST /api/v1/fare-rules/summary</w:t>
       </w:r>
@@ -5077,7 +5105,7 @@
         <w:pStyle w:val="Heading2"/>
         <w:keepNext/>
       </w:pPr>
-      <w:bookmarkStart w:id="14" w:name="_Toc240999893"/>
+      <w:bookmarkStart w:id="14" w:name="_Toc241000378"/>
       <w:r>
         <w:lastRenderedPageBreak/>
         <w:t>3.3 POST /api/v1/fare-rules/chat/stream</w:t>
@@ -5433,7 +5461,7 @@
         <w:pStyle w:val="Heading2"/>
         <w:keepNext/>
       </w:pPr>
-      <w:bookmarkStart w:id="15" w:name="_Toc240999894"/>
+      <w:bookmarkStart w:id="15" w:name="_Toc241000379"/>
       <w:r>
         <w:t>3.4 Other endpoints</w:t>
       </w:r>
@@ -5781,7 +5809,7 @@
         <w:pStyle w:val="Heading2"/>
         <w:keepNext/>
       </w:pPr>
-      <w:bookmarkStart w:id="16" w:name="_Toc240999895"/>
+      <w:bookmarkStart w:id="16" w:name="_Toc241000380"/>
       <w:r>
         <w:t>3.5 Interactive documentation (Swagger UI)</w:t>
       </w:r>
@@ -5846,10 +5874,10 @@
         </w:rPr>
         <w:lastRenderedPageBreak/>
         <w:drawing>
-          <wp:inline distT="0" distB="0" distL="0" distR="0" wp14:anchorId="6B17DEA4" wp14:editId="0DC5337D">
+          <wp:inline distT="0" distB="0" distL="0" distR="0" wp14:anchorId="1146C9C8" wp14:editId="63B7C895">
             <wp:extent cx="6400800" cy="5553075"/>
             <wp:effectExtent l="0" t="0" r="0" b="0"/>
-            <wp:docPr id="826824024" name="Picture 826824024"/>
+            <wp:docPr id="995216862" name="Picture 995216862"/>
             <wp:cNvGraphicFramePr>
               <a:graphicFrameLocks xmlns:a="http://schemas.openxmlformats.org/drawingml/2006/main" noChangeAspect="1"/>
             </wp:cNvGraphicFramePr>
@@ -5913,10 +5941,10 @@
         </w:rPr>
         <w:lastRenderedPageBreak/>
         <w:drawing>
-          <wp:inline distT="0" distB="0" distL="0" distR="0" wp14:anchorId="61550A44" wp14:editId="1677B3F7">
+          <wp:inline distT="0" distB="0" distL="0" distR="0" wp14:anchorId="1C96EE8C" wp14:editId="654A3258">
             <wp:extent cx="4505325" cy="7429500"/>
             <wp:effectExtent l="0" t="0" r="0" b="0"/>
-            <wp:docPr id="52746582" name="Picture 52746582"/>
+            <wp:docPr id="1287932157" name="Picture 1287932157"/>
             <wp:cNvGraphicFramePr>
               <a:graphicFrameLocks xmlns:a="http://schemas.openxmlformats.org/drawingml/2006/main" noChangeAspect="1"/>
             </wp:cNvGraphicFramePr>
@@ -5974,7 +6002,7 @@
         <w:keepNext/>
         <w:pageBreakBefore/>
       </w:pPr>
-      <w:bookmarkStart w:id="17" w:name="_Toc240999896"/>
+      <w:bookmarkStart w:id="17" w:name="_Toc241000381"/>
       <w:r>
         <w:lastRenderedPageBreak/>
         <w:t>4. Configuration</w:t>
@@ -6020,7 +6048,7 @@
         <w:pStyle w:val="Heading2"/>
         <w:keepNext/>
       </w:pPr>
-      <w:bookmarkStart w:id="18" w:name="_Toc240999897"/>
+      <w:bookmarkStart w:id="18" w:name="_Toc241000382"/>
       <w:r>
         <w:t>4.1 Environment variables</w:t>
       </w:r>
@@ -7261,7 +7289,7 @@
         <w:pStyle w:val="Heading2"/>
         <w:keepNext/>
       </w:pPr>
-      <w:bookmarkStart w:id="19" w:name="_Toc240999898"/>
+      <w:bookmarkStart w:id="19" w:name="_Toc241000383"/>
       <w:r>
         <w:t>4.2 LLM providers</w:t>
       </w:r>
@@ -7922,7 +7950,7 @@
         <w:pStyle w:val="Heading2"/>
         <w:keepNext/>
       </w:pPr>
-      <w:bookmarkStart w:id="20" w:name="_Toc240999899"/>
+      <w:bookmarkStart w:id="20" w:name="_Toc241000384"/>
       <w:r>
         <w:lastRenderedPageBreak/>
         <w:t>4.3 Using your own Postgres / Redis</w:t>
@@ -7958,10 +7986,10 @@
           <w:noProof/>
         </w:rPr>
         <w:drawing>
-          <wp:inline distT="0" distB="0" distL="0" distR="0" wp14:anchorId="093FB55E" wp14:editId="6C1D982F">
+          <wp:inline distT="0" distB="0" distL="0" distR="0" wp14:anchorId="6A7A50BA" wp14:editId="7177EBF3">
             <wp:extent cx="6400800" cy="4000500"/>
             <wp:effectExtent l="0" t="0" r="0" b="0"/>
-            <wp:docPr id="823992795" name="Picture 823992795"/>
+            <wp:docPr id="605279551" name="Picture 605279551"/>
             <wp:cNvGraphicFramePr>
               <a:graphicFrameLocks xmlns:a="http://schemas.openxmlformats.org/drawingml/2006/main" noChangeAspect="1"/>
             </wp:cNvGraphicFramePr>
@@ -8018,7 +8046,7 @@
         <w:pStyle w:val="Heading2"/>
         <w:keepNext/>
       </w:pPr>
-      <w:bookmarkStart w:id="21" w:name="_Toc240999900"/>
+      <w:bookmarkStart w:id="21" w:name="_Toc241000385"/>
       <w:r>
         <w:t>4.4 Prompts</w:t>
       </w:r>
@@ -8054,10 +8082,10 @@
         </w:rPr>
         <w:lastRenderedPageBreak/>
         <w:drawing>
-          <wp:inline distT="0" distB="0" distL="0" distR="0" wp14:anchorId="46643664" wp14:editId="0D8762CA">
+          <wp:inline distT="0" distB="0" distL="0" distR="0" wp14:anchorId="20A3B733" wp14:editId="43B7E4FC">
             <wp:extent cx="6400800" cy="4000500"/>
             <wp:effectExtent l="0" t="0" r="0" b="0"/>
-            <wp:docPr id="220532690" name="Picture 220532690"/>
+            <wp:docPr id="449810974" name="Picture 449810974"/>
             <wp:cNvGraphicFramePr>
               <a:graphicFrameLocks xmlns:a="http://schemas.openxmlformats.org/drawingml/2006/main" noChangeAspect="1"/>
             </wp:cNvGraphicFramePr>
@@ -8188,7 +8216,7 @@
         <w:keepNext/>
         <w:pageBreakBefore/>
       </w:pPr>
-      <w:bookmarkStart w:id="22" w:name="_Toc240999901"/>
+      <w:bookmarkStart w:id="22" w:name="_Toc241000386"/>
       <w:r>
         <w:lastRenderedPageBreak/>
         <w:t>5. Architecture</w:t>
@@ -8200,7 +8228,7 @@
         <w:pStyle w:val="Heading2"/>
         <w:keepNext/>
       </w:pPr>
-      <w:bookmarkStart w:id="23" w:name="_Toc240999902"/>
+      <w:bookmarkStart w:id="23" w:name="_Toc241000387"/>
       <w:r>
         <w:t>5.1 Request flow</w:t>
       </w:r>
@@ -8323,7 +8351,7 @@
         <w:pStyle w:val="Heading2"/>
         <w:keepNext/>
       </w:pPr>
-      <w:bookmarkStart w:id="24" w:name="_Toc240999903"/>
+      <w:bookmarkStart w:id="24" w:name="_Toc241000388"/>
       <w:r>
         <w:t>5.2 Code layout</w:t>
       </w:r>
@@ -8489,7 +8517,7 @@
         <w:pStyle w:val="Heading2"/>
         <w:keepNext/>
       </w:pPr>
-      <w:bookmarkStart w:id="25" w:name="_Toc240999904"/>
+      <w:bookmarkStart w:id="25" w:name="_Toc241000389"/>
       <w:r>
         <w:t>5.3 Technology</w:t>
       </w:r>
@@ -8885,7 +8913,7 @@
         <w:keepNext/>
         <w:pageBreakBefore/>
       </w:pPr>
-      <w:bookmarkStart w:id="26" w:name="_Toc240999905"/>
+      <w:bookmarkStart w:id="26" w:name="_Toc241000390"/>
       <w:r>
         <w:lastRenderedPageBreak/>
         <w:t>6. Deployment</w:t>
@@ -8897,7 +8925,7 @@
         <w:pStyle w:val="Heading2"/>
         <w:keepNext/>
       </w:pPr>
-      <w:bookmarkStart w:id="27" w:name="_Toc240999906"/>
+      <w:bookmarkStart w:id="27" w:name="_Toc241000391"/>
       <w:r>
         <w:t>6.1 Production checklist</w:t>
       </w:r>
@@ -9025,7 +9053,7 @@
         <w:pStyle w:val="Heading2"/>
         <w:keepNext/>
       </w:pPr>
-      <w:bookmarkStart w:id="28" w:name="_Toc240999907"/>
+      <w:bookmarkStart w:id="28" w:name="_Toc241000392"/>
       <w:r>
         <w:t>6.2 Reverse proxy</w:t>
       </w:r>
@@ -9207,7 +9235,7 @@
         <w:pStyle w:val="Heading2"/>
         <w:keepNext/>
       </w:pPr>
-      <w:bookmarkStart w:id="29" w:name="_Toc240999908"/>
+      <w:bookmarkStart w:id="29" w:name="_Toc241000393"/>
       <w:r>
         <w:t>6.3 Scaling, persistence and upgrades</w:t>
       </w:r>
@@ -9348,7 +9376,7 @@
         <w:pStyle w:val="Heading2"/>
         <w:keepNext/>
       </w:pPr>
-      <w:bookmarkStart w:id="30" w:name="_Toc240999909"/>
+      <w:bookmarkStart w:id="30" w:name="_Toc241000394"/>
       <w:r>
         <w:lastRenderedPageBreak/>
         <w:t>6.4 What FareLens stores</w:t>
@@ -10100,7 +10128,7 @@
         <w:keepNext/>
         <w:pageBreakBefore/>
       </w:pPr>
-      <w:bookmarkStart w:id="31" w:name="_Toc240999910"/>
+      <w:bookmarkStart w:id="31" w:name="_Toc241000395"/>
       <w:r>
         <w:lastRenderedPageBreak/>
         <w:t>7. Contributing, credits and license</w:t>
@@ -10403,273 +10431,273 @@
 <file path=word/numbering.xml><?xml version="1.0" encoding="utf-8"?>
 <w:numbering xmlns:wpc="http://schemas.microsoft.com/office/word/2010/wordprocessingCanvas" xmlns:cx="http://schemas.microsoft.com/office/drawing/2014/chartex" xmlns:cx1="http://schemas.microsoft.com/office/drawing/2015/9/8/chartex" xmlns:cx2="http://schemas.microsoft.com/office/drawing/2015/10/21/chartex" xmlns:cx3="http://schemas.microsoft.com/office/drawing/2016/5/9/chartex" xmlns:cx4="http://schemas.microsoft.com/office/drawing/2016/5/10/chartex" xmlns:cx5="http://schemas.microsoft.com/office/drawing/2016/5/11/chartex" xmlns:cx6="http://schemas.microsoft.com/office/drawing/2016/5/12/chartex" xmlns:cx7="http://schemas.microsoft.com/office/drawing/2016/5/13/chartex" xmlns:cx8="http://schemas.microsoft.com/office/drawing/2016/5/14/chartex" xmlns:mc="http://schemas.openxmlformats.org/markup-compatibility/2006" xmlns:aink="http://schemas.microsoft.com/office/drawing/2016/ink" xmlns:am3d="http://schemas.microsoft.com/office/drawing/2017/model3d" xmlns:o="urn:schemas-microsoft-com:office:office" xmlns:oel="http://schemas.microsoft.com/office/2019/extlst" xmlns:r="http://schemas.openxmlformats.org/officeDocument/2006/relationships" xmlns:m="http://schemas.openxmlformats.org/officeDocument/2006/math" xmlns:v="urn:schemas-microsoft-com:vml" xmlns:wp14="http://schemas.microsoft.com/office/word/2010/wordprocessingDrawing" xmlns:wp="http://schemas.openxmlformats.org/drawingml/2006/wordprocessingDrawing" xmlns:w10="urn:schemas-microsoft-com:office:word" xmlns:w="http://schemas.openxmlformats.org/wordprocessingml/2006/main" xmlns:w14="http://schemas.microsoft.com/office/word/2010/wordml" xmlns:w15="http://schemas.microsoft.com/office/word/2012/wordml" xmlns:w16cex="http://schemas.microsoft.com/office/word/2018/wordml/cex" xmlns:w16cid="http://schemas.microsoft.com/office/word/2016/wordml/cid" xmlns:w16="http://schemas.microsoft.com/office/word/2018/wordml" xmlns:w16du="http://schemas.microsoft.com/office/word/2023/wordml/word16du" xmlns:w16sdtdh="http://schemas.microsoft.com/office/word/2020/wordml/sdtdatahash" xmlns:w16sdtfl="http://schemas.microsoft.com/office/word/2024/wordml/sdtformatlock" xmlns:w16se="http://schemas.microsoft.com/office/word/2015/wordml/symex" xmlns:wpg="http://schemas.microsoft.com/office/word/2010/wordprocessingGroup" xmlns:wpi="http://schemas.microsoft.com/office/word/2010/wordprocessingInk" xmlns:wne="http://schemas.microsoft.com/office/word/2006/wordml" xmlns:wps="http://schemas.microsoft.com/office/word/2010/wordprocessingShape" mc:Ignorable="w14 w15 w16se w16cid w16 w16cex w16sdtdh w16sdtfl w16du wp14">
   <w:abstractNum w:abstractNumId="0" w15:restartNumberingAfterBreak="0">
-    <w:nsid w:val="1FE66023"/>
+    <w:nsid w:val="3B8A56C2"/>
     <w:multiLevelType w:val="hybridMultilevel"/>
-    <w:tmpl w:val="E0BC0EF4"/>
-    <w:lvl w:ilvl="0" w:tplc="EA682648">
+    <w:tmpl w:val="33082562"/>
+    <w:lvl w:ilvl="0" w:tplc="7A126628">
       <w:start w:val="1"/>
       <w:numFmt w:val="bullet"/>
-      <w:lvlText w:val="•"/>
+      <w:lvlText w:val="●"/>
       <w:lvlJc w:val="left"/>
       <w:pPr>
-        <w:ind w:left="540" w:hanging="270"/>
+        <w:ind w:left="720" w:hanging="360"/>
       </w:pPr>
     </w:lvl>
-    <w:lvl w:ilvl="1" w:tplc="101E8E32">
+    <w:lvl w:ilvl="1" w:tplc="637AA1EC">
+      <w:start w:val="1"/>
+      <w:numFmt w:val="bullet"/>
+      <w:lvlText w:val="○"/>
+      <w:lvlJc w:val="left"/>
+      <w:pPr>
+        <w:ind w:left="1440" w:hanging="360"/>
+      </w:pPr>
+    </w:lvl>
+    <w:lvl w:ilvl="2" w:tplc="42E47ECA">
+      <w:start w:val="1"/>
+      <w:numFmt w:val="bullet"/>
+      <w:lvlText w:val="■"/>
+      <w:lvlJc w:val="left"/>
+      <w:pPr>
+        <w:ind w:left="2160" w:hanging="360"/>
+      </w:pPr>
+    </w:lvl>
+    <w:lvl w:ilvl="3" w:tplc="9FC6FF08">
+      <w:start w:val="1"/>
+      <w:numFmt w:val="bullet"/>
+      <w:lvlText w:val="●"/>
+      <w:lvlJc w:val="left"/>
+      <w:pPr>
+        <w:ind w:left="2880" w:hanging="360"/>
+      </w:pPr>
+    </w:lvl>
+    <w:lvl w:ilvl="4" w:tplc="66345190">
+      <w:start w:val="1"/>
+      <w:numFmt w:val="bullet"/>
+      <w:lvlText w:val="○"/>
+      <w:lvlJc w:val="left"/>
+      <w:pPr>
+        <w:ind w:left="3600" w:hanging="360"/>
+      </w:pPr>
+    </w:lvl>
+    <w:lvl w:ilvl="5" w:tplc="7A7C8864">
+      <w:start w:val="1"/>
+      <w:numFmt w:val="bullet"/>
+      <w:lvlText w:val="■"/>
+      <w:lvlJc w:val="left"/>
+      <w:pPr>
+        <w:ind w:left="4320" w:hanging="360"/>
+      </w:pPr>
+    </w:lvl>
+    <w:lvl w:ilvl="6" w:tplc="CCB83130">
+      <w:start w:val="1"/>
+      <w:numFmt w:val="bullet"/>
+      <w:lvlText w:val="●"/>
+      <w:lvlJc w:val="left"/>
+      <w:pPr>
+        <w:ind w:left="5040" w:hanging="360"/>
+      </w:pPr>
+    </w:lvl>
+    <w:lvl w:ilvl="7" w:tplc="5E08C406">
+      <w:start w:val="1"/>
+      <w:numFmt w:val="bullet"/>
+      <w:lvlText w:val="●"/>
+      <w:lvlJc w:val="left"/>
+      <w:pPr>
+        <w:ind w:left="5760" w:hanging="360"/>
+      </w:pPr>
+    </w:lvl>
+    <w:lvl w:ilvl="8" w:tplc="B2C84F1C">
+      <w:start w:val="1"/>
+      <w:numFmt w:val="bullet"/>
+      <w:lvlText w:val="●"/>
+      <w:lvlJc w:val="left"/>
+      <w:pPr>
+        <w:ind w:left="6480" w:hanging="360"/>
+      </w:pPr>
+    </w:lvl>
+  </w:abstractNum>
+  <w:abstractNum w:abstractNumId="1" w15:restartNumberingAfterBreak="0">
+    <w:nsid w:val="4081467E"/>
+    <w:multiLevelType w:val="hybridMultilevel"/>
+    <w:tmpl w:val="3154C39E"/>
+    <w:lvl w:ilvl="0" w:tplc="064AC466">
+      <w:start w:val="1"/>
+      <w:numFmt w:val="decimal"/>
+      <w:lvlText w:val="%1."/>
+      <w:lvlJc w:val="left"/>
+      <w:pPr>
+        <w:ind w:left="540" w:hanging="360"/>
+      </w:pPr>
+    </w:lvl>
+    <w:lvl w:ilvl="1" w:tplc="3604800C">
       <w:numFmt w:val="decimal"/>
       <w:lvlText w:val=""/>
       <w:lvlJc w:val="left"/>
     </w:lvl>
-    <w:lvl w:ilvl="2" w:tplc="84FC3442">
+    <w:lvl w:ilvl="2" w:tplc="E19813D6">
       <w:numFmt w:val="decimal"/>
       <w:lvlText w:val=""/>
       <w:lvlJc w:val="left"/>
     </w:lvl>
-    <w:lvl w:ilvl="3" w:tplc="334A0D26">
+    <w:lvl w:ilvl="3" w:tplc="4DDAF410">
       <w:numFmt w:val="decimal"/>
       <w:lvlText w:val=""/>
       <w:lvlJc w:val="left"/>
     </w:lvl>
-    <w:lvl w:ilvl="4" w:tplc="CCD80828">
+    <w:lvl w:ilvl="4" w:tplc="B76AF0F8">
       <w:numFmt w:val="decimal"/>
       <w:lvlText w:val=""/>
       <w:lvlJc w:val="left"/>
     </w:lvl>
-    <w:lvl w:ilvl="5" w:tplc="3AECFFD0">
+    <w:lvl w:ilvl="5" w:tplc="FE8CFC28">
       <w:numFmt w:val="decimal"/>
       <w:lvlText w:val=""/>
       <w:lvlJc w:val="left"/>
     </w:lvl>
-    <w:lvl w:ilvl="6" w:tplc="7070FD70">
+    <w:lvl w:ilvl="6" w:tplc="4B4E721C">
       <w:numFmt w:val="decimal"/>
       <w:lvlText w:val=""/>
       <w:lvlJc w:val="left"/>
     </w:lvl>
-    <w:lvl w:ilvl="7" w:tplc="8054B324">
+    <w:lvl w:ilvl="7" w:tplc="1CCC4254">
       <w:numFmt w:val="decimal"/>
       <w:lvlText w:val=""/>
       <w:lvlJc w:val="left"/>
     </w:lvl>
-    <w:lvl w:ilvl="8" w:tplc="1EAE81D2">
+    <w:lvl w:ilvl="8" w:tplc="23889EB6">
       <w:numFmt w:val="decimal"/>
       <w:lvlText w:val=""/>
       <w:lvlJc w:val="left"/>
     </w:lvl>
   </w:abstractNum>
-  <w:abstractNum w:abstractNumId="1" w15:restartNumberingAfterBreak="0">
-    <w:nsid w:val="51E21A2B"/>
+  <w:abstractNum w:abstractNumId="2" w15:restartNumberingAfterBreak="0">
+    <w:nsid w:val="5C557723"/>
     <w:multiLevelType w:val="hybridMultilevel"/>
-    <w:tmpl w:val="9DC64AE0"/>
-    <w:lvl w:ilvl="0" w:tplc="CBA4C8A2">
+    <w:tmpl w:val="879628DE"/>
+    <w:lvl w:ilvl="0" w:tplc="2AD80D60">
       <w:start w:val="1"/>
       <w:numFmt w:val="bullet"/>
-      <w:lvlText w:val="●"/>
+      <w:lvlText w:val="☐"/>
       <w:lvlJc w:val="left"/>
       <w:pPr>
-        <w:ind w:left="720" w:hanging="360"/>
+        <w:ind w:left="540" w:hanging="320"/>
       </w:pPr>
     </w:lvl>
-    <w:lvl w:ilvl="1" w:tplc="99AE3D64">
-      <w:start w:val="1"/>
-      <w:numFmt w:val="bullet"/>
-      <w:lvlText w:val="○"/>
-      <w:lvlJc w:val="left"/>
-      <w:pPr>
-        <w:ind w:left="1440" w:hanging="360"/>
-      </w:pPr>
-    </w:lvl>
-    <w:lvl w:ilvl="2" w:tplc="6ED67C3A">
-      <w:start w:val="1"/>
-      <w:numFmt w:val="bullet"/>
-      <w:lvlText w:val="■"/>
-      <w:lvlJc w:val="left"/>
-      <w:pPr>
-        <w:ind w:left="2160" w:hanging="360"/>
-      </w:pPr>
-    </w:lvl>
-    <w:lvl w:ilvl="3" w:tplc="63564B30">
-      <w:start w:val="1"/>
-      <w:numFmt w:val="bullet"/>
-      <w:lvlText w:val="●"/>
-      <w:lvlJc w:val="left"/>
-      <w:pPr>
-        <w:ind w:left="2880" w:hanging="360"/>
-      </w:pPr>
-    </w:lvl>
-    <w:lvl w:ilvl="4" w:tplc="D0AE2394">
-      <w:start w:val="1"/>
-      <w:numFmt w:val="bullet"/>
-      <w:lvlText w:val="○"/>
-      <w:lvlJc w:val="left"/>
-      <w:pPr>
-        <w:ind w:left="3600" w:hanging="360"/>
-      </w:pPr>
-    </w:lvl>
-    <w:lvl w:ilvl="5" w:tplc="6B4CB1A2">
-      <w:start w:val="1"/>
-      <w:numFmt w:val="bullet"/>
-      <w:lvlText w:val="■"/>
-      <w:lvlJc w:val="left"/>
-      <w:pPr>
-        <w:ind w:left="4320" w:hanging="360"/>
-      </w:pPr>
-    </w:lvl>
-    <w:lvl w:ilvl="6" w:tplc="1D3CC772">
-      <w:start w:val="1"/>
-      <w:numFmt w:val="bullet"/>
-      <w:lvlText w:val="●"/>
-      <w:lvlJc w:val="left"/>
-      <w:pPr>
-        <w:ind w:left="5040" w:hanging="360"/>
-      </w:pPr>
-    </w:lvl>
-    <w:lvl w:ilvl="7" w:tplc="DAD2654E">
-      <w:start w:val="1"/>
-      <w:numFmt w:val="bullet"/>
-      <w:lvlText w:val="●"/>
-      <w:lvlJc w:val="left"/>
-      <w:pPr>
-        <w:ind w:left="5760" w:hanging="360"/>
-      </w:pPr>
-    </w:lvl>
-    <w:lvl w:ilvl="8" w:tplc="C70E1B58">
-      <w:start w:val="1"/>
-      <w:numFmt w:val="bullet"/>
-      <w:lvlText w:val="●"/>
-      <w:lvlJc w:val="left"/>
-      <w:pPr>
-        <w:ind w:left="6480" w:hanging="360"/>
-      </w:pPr>
-    </w:lvl>
-  </w:abstractNum>
-  <w:abstractNum w:abstractNumId="2" w15:restartNumberingAfterBreak="0">
-    <w:nsid w:val="6D7C0751"/>
-    <w:multiLevelType w:val="hybridMultilevel"/>
-    <w:tmpl w:val="A6DE4654"/>
-    <w:lvl w:ilvl="0" w:tplc="98A6BF76">
-      <w:start w:val="1"/>
-      <w:numFmt w:val="decimal"/>
-      <w:lvlText w:val="%1."/>
-      <w:lvlJc w:val="left"/>
-      <w:pPr>
-        <w:ind w:left="540" w:hanging="360"/>
-      </w:pPr>
-    </w:lvl>
-    <w:lvl w:ilvl="1" w:tplc="CD721970">
+    <w:lvl w:ilvl="1" w:tplc="8772941A">
       <w:numFmt w:val="decimal"/>
       <w:lvlText w:val=""/>
       <w:lvlJc w:val="left"/>
     </w:lvl>
-    <w:lvl w:ilvl="2" w:tplc="3FB46D14">
+    <w:lvl w:ilvl="2" w:tplc="4A368B2E">
       <w:numFmt w:val="decimal"/>
       <w:lvlText w:val=""/>
       <w:lvlJc w:val="left"/>
     </w:lvl>
-    <w:lvl w:ilvl="3" w:tplc="1B7E2718">
+    <w:lvl w:ilvl="3" w:tplc="F3489D68">
       <w:numFmt w:val="decimal"/>
       <w:lvlText w:val=""/>
       <w:lvlJc w:val="left"/>
     </w:lvl>
-    <w:lvl w:ilvl="4" w:tplc="51767ED4">
+    <w:lvl w:ilvl="4" w:tplc="1DE0971C">
       <w:numFmt w:val="decimal"/>
       <w:lvlText w:val=""/>
       <w:lvlJc w:val="left"/>
     </w:lvl>
-    <w:lvl w:ilvl="5" w:tplc="1870D248">
+    <w:lvl w:ilvl="5" w:tplc="93CC651E">
       <w:numFmt w:val="decimal"/>
       <w:lvlText w:val=""/>
       <w:lvlJc w:val="left"/>
     </w:lvl>
-    <w:lvl w:ilvl="6" w:tplc="9A66C9F2">
+    <w:lvl w:ilvl="6" w:tplc="CAFCC316">
       <w:numFmt w:val="decimal"/>
       <w:lvlText w:val=""/>
       <w:lvlJc w:val="left"/>
     </w:lvl>
-    <w:lvl w:ilvl="7" w:tplc="FA2C28AE">
+    <w:lvl w:ilvl="7" w:tplc="D1924552">
       <w:numFmt w:val="decimal"/>
       <w:lvlText w:val=""/>
       <w:lvlJc w:val="left"/>
     </w:lvl>
-    <w:lvl w:ilvl="8" w:tplc="1A30F050">
+    <w:lvl w:ilvl="8" w:tplc="D0026660">
       <w:numFmt w:val="decimal"/>
       <w:lvlText w:val=""/>
       <w:lvlJc w:val="left"/>
     </w:lvl>
   </w:abstractNum>
   <w:abstractNum w:abstractNumId="3" w15:restartNumberingAfterBreak="0">
-    <w:nsid w:val="777C21A9"/>
+    <w:nsid w:val="61BD5394"/>
     <w:multiLevelType w:val="hybridMultilevel"/>
-    <w:tmpl w:val="15D6FB9A"/>
-    <w:lvl w:ilvl="0" w:tplc="CD2A6BF4">
+    <w:tmpl w:val="341C6716"/>
+    <w:lvl w:ilvl="0" w:tplc="0F6889AE">
       <w:start w:val="1"/>
       <w:numFmt w:val="bullet"/>
-      <w:lvlText w:val="☐"/>
+      <w:lvlText w:val="•"/>
       <w:lvlJc w:val="left"/>
       <w:pPr>
-        <w:ind w:left="540" w:hanging="320"/>
+        <w:ind w:left="540" w:hanging="270"/>
       </w:pPr>
     </w:lvl>
-    <w:lvl w:ilvl="1" w:tplc="06E03ECE">
+    <w:lvl w:ilvl="1" w:tplc="469A119A">
       <w:numFmt w:val="decimal"/>
       <w:lvlText w:val=""/>
       <w:lvlJc w:val="left"/>
     </w:lvl>
-    <w:lvl w:ilvl="2" w:tplc="D76CE4D6">
+    <w:lvl w:ilvl="2" w:tplc="BE289510">
       <w:numFmt w:val="decimal"/>
       <w:lvlText w:val=""/>
       <w:lvlJc w:val="left"/>
     </w:lvl>
-    <w:lvl w:ilvl="3" w:tplc="9462DF3A">
+    <w:lvl w:ilvl="3" w:tplc="2BB40618">
       <w:numFmt w:val="decimal"/>
       <w:lvlText w:val=""/>
       <w:lvlJc w:val="left"/>
     </w:lvl>
-    <w:lvl w:ilvl="4" w:tplc="5F56F71C">
+    <w:lvl w:ilvl="4" w:tplc="2E7EE7B4">
       <w:numFmt w:val="decimal"/>
       <w:lvlText w:val=""/>
       <w:lvlJc w:val="left"/>
     </w:lvl>
-    <w:lvl w:ilvl="5" w:tplc="921CBF70">
+    <w:lvl w:ilvl="5" w:tplc="8FC05C20">
       <w:numFmt w:val="decimal"/>
       <w:lvlText w:val=""/>
       <w:lvlJc w:val="left"/>
     </w:lvl>
-    <w:lvl w:ilvl="6" w:tplc="C60C7302">
+    <w:lvl w:ilvl="6" w:tplc="8F948544">
       <w:numFmt w:val="decimal"/>
       <w:lvlText w:val=""/>
       <w:lvlJc w:val="left"/>
     </w:lvl>
-    <w:lvl w:ilvl="7" w:tplc="781AFBAA">
+    <w:lvl w:ilvl="7" w:tplc="EDFC95A8">
       <w:numFmt w:val="decimal"/>
       <w:lvlText w:val=""/>
       <w:lvlJc w:val="left"/>
     </w:lvl>
-    <w:lvl w:ilvl="8" w:tplc="4238F1A4">
+    <w:lvl w:ilvl="8" w:tplc="F836DB94">
       <w:numFmt w:val="decimal"/>
       <w:lvlText w:val=""/>
       <w:lvlJc w:val="left"/>
     </w:lvl>
   </w:abstractNum>
-  <w:num w:numId="1" w16cid:durableId="745034843">
+  <w:num w:numId="1" w16cid:durableId="1244341211">
+    <w:abstractNumId w:val="0"/>
+    <w:lvlOverride w:ilvl="0">
+      <w:startOverride w:val="1"/>
+    </w:lvlOverride>
+  </w:num>
+  <w:num w:numId="2" w16cid:durableId="1370490977">
     <w:abstractNumId w:val="1"/>
     <w:lvlOverride w:ilvl="0">
       <w:startOverride w:val="1"/>
     </w:lvlOverride>
   </w:num>
-  <w:num w:numId="2" w16cid:durableId="1241790271">
+  <w:num w:numId="3" w16cid:durableId="1259875077">
     <w:abstractNumId w:val="2"/>
     <w:lvlOverride w:ilvl="0">
       <w:startOverride w:val="1"/>
     </w:lvlOverride>
   </w:num>
-  <w:num w:numId="3" w16cid:durableId="240720998">
+  <w:num w:numId="4" w16cid:durableId="1866557861">
     <w:abstractNumId w:val="3"/>
-    <w:lvlOverride w:ilvl="0">
-      <w:startOverride w:val="1"/>
-    </w:lvlOverride>
-  </w:num>
-  <w:num w:numId="4" w16cid:durableId="434063057">
-    <w:abstractNumId w:val="0"/>
     <w:lvlOverride w:ilvl="0">
       <w:startOverride w:val="1"/>
     </w:lvlOverride>
@@ -11109,7 +11137,6 @@
   <w:style w:type="paragraph" w:styleId="Heading3">
     <w:name w:val="heading 3"/>
     <w:uiPriority w:val="9"/>
-    <w:semiHidden/>
     <w:unhideWhenUsed/>
     <w:qFormat/>
     <w:pPr>
@@ -11290,7 +11317,7 @@
     <w:autoRedefine/>
     <w:uiPriority w:val="39"/>
     <w:unhideWhenUsed/>
-    <w:rsid w:val="00673B9A"/>
+    <w:rsid w:val="008F5842"/>
     <w:pPr>
       <w:spacing w:after="100"/>
     </w:pPr>
@@ -11302,7 +11329,7 @@
     <w:autoRedefine/>
     <w:uiPriority w:val="39"/>
     <w:unhideWhenUsed/>
-    <w:rsid w:val="00673B9A"/>
+    <w:rsid w:val="008F5842"/>
     <w:pPr>
       <w:spacing w:after="100"/>
       <w:ind w:left="210"/>

</xml_diff>

<commit_message>
docs: tighten the GDS/NDC problem statement
</commit_message>
<xml_diff>
--- a/docs/FareLens.docx
+++ b/docs/FareLens.docx
@@ -17,7 +17,7 @@
           <w:noProof/>
         </w:rPr>
         <w:drawing>
-          <wp:inline distT="0" distB="0" distL="0" distR="0" wp14:anchorId="057C7575" wp14:editId="12B2B5A4">
+          <wp:inline distT="0" distB="0" distL="0" distR="0" wp14:anchorId="5D477A8C" wp14:editId="1A353A68">
             <wp:extent cx="1905000" cy="266700"/>
             <wp:effectExtent l="0" t="0" r="0" b="0"/>
             <wp:docPr id="1" name="Picture 1"/>
@@ -173,14 +173,13 @@
           <w:sz w:val="40"/>
           <w:szCs w:val="40"/>
         </w:rPr>
-        <w:lastRenderedPageBreak/>
         <w:t>Contents</w:t>
       </w:r>
     </w:p>
     <w:sdt>
       <w:sdtPr>
         <w:alias w:val="Contents"/>
-        <w:id w:val="-1575727786"/>
+        <w:id w:val="-1608953249"/>
       </w:sdtPr>
       <w:sdtEndPr/>
       <w:sdtContent>
@@ -209,7 +208,7 @@
           <w:r>
             <w:fldChar w:fldCharType="separate"/>
           </w:r>
-          <w:hyperlink w:anchor="_Toc241000364" w:history="1">
+          <w:hyperlink w:anchor="_Toc241000473" w:history="1">
             <w:r>
               <w:rPr>
                 <w:rStyle w:val="Hyperlink"/>
@@ -233,7 +232,7 @@
               <w:rPr>
                 <w:noProof/>
               </w:rPr>
-              <w:instrText xml:space="preserve"> PAGEREF _Toc241000364 \h </w:instrText>
+              <w:instrText xml:space="preserve"> PAGEREF _Toc241000473 \h </w:instrText>
             </w:r>
             <w:r>
               <w:rPr>
@@ -276,7 +275,7 @@
               <w14:ligatures w14:val="standardContextual"/>
             </w:rPr>
           </w:pPr>
-          <w:hyperlink w:anchor="_Toc241000365" w:history="1">
+          <w:hyperlink w:anchor="_Toc241000474" w:history="1">
             <w:r>
               <w:rPr>
                 <w:rStyle w:val="Hyperlink"/>
@@ -300,7 +299,7 @@
               <w:rPr>
                 <w:noProof/>
               </w:rPr>
-              <w:instrText xml:space="preserve"> PAGEREF _Toc241000365 \h </w:instrText>
+              <w:instrText xml:space="preserve"> PAGEREF _Toc241000474 \h </w:instrText>
             </w:r>
             <w:r>
               <w:rPr>
@@ -343,7 +342,7 @@
               <w14:ligatures w14:val="standardContextual"/>
             </w:rPr>
           </w:pPr>
-          <w:hyperlink w:anchor="_Toc241000366" w:history="1">
+          <w:hyperlink w:anchor="_Toc241000475" w:history="1">
             <w:r>
               <w:rPr>
                 <w:rStyle w:val="Hyperlink"/>
@@ -367,7 +366,7 @@
               <w:rPr>
                 <w:noProof/>
               </w:rPr>
-              <w:instrText xml:space="preserve"> PAGEREF _Toc241000366 \h </w:instrText>
+              <w:instrText xml:space="preserve"> PAGEREF _Toc241000475 \h </w:instrText>
             </w:r>
             <w:r>
               <w:rPr>
@@ -410,7 +409,7 @@
               <w14:ligatures w14:val="standardContextual"/>
             </w:rPr>
           </w:pPr>
-          <w:hyperlink w:anchor="_Toc241000367" w:history="1">
+          <w:hyperlink w:anchor="_Toc241000476" w:history="1">
             <w:r>
               <w:rPr>
                 <w:rStyle w:val="Hyperlink"/>
@@ -434,7 +433,7 @@
               <w:rPr>
                 <w:noProof/>
               </w:rPr>
-              <w:instrText xml:space="preserve"> PAGEREF _Toc241000367 \h </w:instrText>
+              <w:instrText xml:space="preserve"> PAGEREF _Toc241000476 \h </w:instrText>
             </w:r>
             <w:r>
               <w:rPr>
@@ -477,7 +476,7 @@
               <w14:ligatures w14:val="standardContextual"/>
             </w:rPr>
           </w:pPr>
-          <w:hyperlink w:anchor="_Toc241000368" w:history="1">
+          <w:hyperlink w:anchor="_Toc241000477" w:history="1">
             <w:r>
               <w:rPr>
                 <w:rStyle w:val="Hyperlink"/>
@@ -501,7 +500,7 @@
               <w:rPr>
                 <w:noProof/>
               </w:rPr>
-              <w:instrText xml:space="preserve"> PAGEREF _Toc241000368 \h </w:instrText>
+              <w:instrText xml:space="preserve"> PAGEREF _Toc241000477 \h </w:instrText>
             </w:r>
             <w:r>
               <w:rPr>
@@ -544,7 +543,7 @@
               <w14:ligatures w14:val="standardContextual"/>
             </w:rPr>
           </w:pPr>
-          <w:hyperlink w:anchor="_Toc241000369" w:history="1">
+          <w:hyperlink w:anchor="_Toc241000478" w:history="1">
             <w:r>
               <w:rPr>
                 <w:rStyle w:val="Hyperlink"/>
@@ -568,7 +567,7 @@
               <w:rPr>
                 <w:noProof/>
               </w:rPr>
-              <w:instrText xml:space="preserve"> PAGEREF _Toc241000369 \h </w:instrText>
+              <w:instrText xml:space="preserve"> PAGEREF _Toc241000478 \h </w:instrText>
             </w:r>
             <w:r>
               <w:rPr>
@@ -611,7 +610,7 @@
               <w14:ligatures w14:val="standardContextual"/>
             </w:rPr>
           </w:pPr>
-          <w:hyperlink w:anchor="_Toc241000370" w:history="1">
+          <w:hyperlink w:anchor="_Toc241000479" w:history="1">
             <w:r>
               <w:rPr>
                 <w:rStyle w:val="Hyperlink"/>
@@ -635,7 +634,7 @@
               <w:rPr>
                 <w:noProof/>
               </w:rPr>
-              <w:instrText xml:space="preserve"> PAGEREF _Toc241000370 \h </w:instrText>
+              <w:instrText xml:space="preserve"> PAGEREF _Toc241000479 \h </w:instrText>
             </w:r>
             <w:r>
               <w:rPr>
@@ -678,7 +677,7 @@
               <w14:ligatures w14:val="standardContextual"/>
             </w:rPr>
           </w:pPr>
-          <w:hyperlink w:anchor="_Toc241000371" w:history="1">
+          <w:hyperlink w:anchor="_Toc241000480" w:history="1">
             <w:r>
               <w:rPr>
                 <w:rStyle w:val="Hyperlink"/>
@@ -702,7 +701,7 @@
               <w:rPr>
                 <w:noProof/>
               </w:rPr>
-              <w:instrText xml:space="preserve"> PAGEREF _Toc241000371 \h </w:instrText>
+              <w:instrText xml:space="preserve"> PAGEREF _Toc241000480 \h </w:instrText>
             </w:r>
             <w:r>
               <w:rPr>
@@ -745,7 +744,7 @@
               <w14:ligatures w14:val="standardContextual"/>
             </w:rPr>
           </w:pPr>
-          <w:hyperlink w:anchor="_Toc241000372" w:history="1">
+          <w:hyperlink w:anchor="_Toc241000481" w:history="1">
             <w:r>
               <w:rPr>
                 <w:rStyle w:val="Hyperlink"/>
@@ -769,7 +768,7 @@
               <w:rPr>
                 <w:noProof/>
               </w:rPr>
-              <w:instrText xml:space="preserve"> PAGEREF _Toc241000372 \h </w:instrText>
+              <w:instrText xml:space="preserve"> PAGEREF _Toc241000481 \h </w:instrText>
             </w:r>
             <w:r>
               <w:rPr>
@@ -812,7 +811,7 @@
               <w14:ligatures w14:val="standardContextual"/>
             </w:rPr>
           </w:pPr>
-          <w:hyperlink w:anchor="_Toc241000373" w:history="1">
+          <w:hyperlink w:anchor="_Toc241000482" w:history="1">
             <w:r>
               <w:rPr>
                 <w:rStyle w:val="Hyperlink"/>
@@ -836,7 +835,7 @@
               <w:rPr>
                 <w:noProof/>
               </w:rPr>
-              <w:instrText xml:space="preserve"> PAGEREF _Toc241000373 \h </w:instrText>
+              <w:instrText xml:space="preserve"> PAGEREF _Toc241000482 \h </w:instrText>
             </w:r>
             <w:r>
               <w:rPr>
@@ -879,7 +878,7 @@
               <w14:ligatures w14:val="standardContextual"/>
             </w:rPr>
           </w:pPr>
-          <w:hyperlink w:anchor="_Toc241000374" w:history="1">
+          <w:hyperlink w:anchor="_Toc241000483" w:history="1">
             <w:r>
               <w:rPr>
                 <w:rStyle w:val="Hyperlink"/>
@@ -903,7 +902,7 @@
               <w:rPr>
                 <w:noProof/>
               </w:rPr>
-              <w:instrText xml:space="preserve"> PAGEREF _Toc241000374 \h </w:instrText>
+              <w:instrText xml:space="preserve"> PAGEREF _Toc241000483 \h </w:instrText>
             </w:r>
             <w:r>
               <w:rPr>
@@ -946,7 +945,7 @@
               <w14:ligatures w14:val="standardContextual"/>
             </w:rPr>
           </w:pPr>
-          <w:hyperlink w:anchor="_Toc241000375" w:history="1">
+          <w:hyperlink w:anchor="_Toc241000484" w:history="1">
             <w:r>
               <w:rPr>
                 <w:rStyle w:val="Hyperlink"/>
@@ -970,7 +969,7 @@
               <w:rPr>
                 <w:noProof/>
               </w:rPr>
-              <w:instrText xml:space="preserve"> PAGEREF _Toc241000375 \h </w:instrText>
+              <w:instrText xml:space="preserve"> PAGEREF _Toc241000484 \h </w:instrText>
             </w:r>
             <w:r>
               <w:rPr>
@@ -1013,7 +1012,7 @@
               <w14:ligatures w14:val="standardContextual"/>
             </w:rPr>
           </w:pPr>
-          <w:hyperlink w:anchor="_Toc241000376" w:history="1">
+          <w:hyperlink w:anchor="_Toc241000485" w:history="1">
             <w:r>
               <w:rPr>
                 <w:rStyle w:val="Hyperlink"/>
@@ -1037,7 +1036,7 @@
               <w:rPr>
                 <w:noProof/>
               </w:rPr>
-              <w:instrText xml:space="preserve"> PAGEREF _Toc241000376 \h </w:instrText>
+              <w:instrText xml:space="preserve"> PAGEREF _Toc241000485 \h </w:instrText>
             </w:r>
             <w:r>
               <w:rPr>
@@ -1080,7 +1079,7 @@
               <w14:ligatures w14:val="standardContextual"/>
             </w:rPr>
           </w:pPr>
-          <w:hyperlink w:anchor="_Toc241000377" w:history="1">
+          <w:hyperlink w:anchor="_Toc241000486" w:history="1">
             <w:r>
               <w:rPr>
                 <w:rStyle w:val="Hyperlink"/>
@@ -1104,7 +1103,7 @@
               <w:rPr>
                 <w:noProof/>
               </w:rPr>
-              <w:instrText xml:space="preserve"> PAGEREF _Toc241000377 \h </w:instrText>
+              <w:instrText xml:space="preserve"> PAGEREF _Toc241000486 \h </w:instrText>
             </w:r>
             <w:r>
               <w:rPr>
@@ -1147,7 +1146,7 @@
               <w14:ligatures w14:val="standardContextual"/>
             </w:rPr>
           </w:pPr>
-          <w:hyperlink w:anchor="_Toc241000378" w:history="1">
+          <w:hyperlink w:anchor="_Toc241000487" w:history="1">
             <w:r>
               <w:rPr>
                 <w:rStyle w:val="Hyperlink"/>
@@ -1171,7 +1170,7 @@
               <w:rPr>
                 <w:noProof/>
               </w:rPr>
-              <w:instrText xml:space="preserve"> PAGEREF _Toc241000378 \h </w:instrText>
+              <w:instrText xml:space="preserve"> PAGEREF _Toc241000487 \h </w:instrText>
             </w:r>
             <w:r>
               <w:rPr>
@@ -1214,7 +1213,7 @@
               <w14:ligatures w14:val="standardContextual"/>
             </w:rPr>
           </w:pPr>
-          <w:hyperlink w:anchor="_Toc241000379" w:history="1">
+          <w:hyperlink w:anchor="_Toc241000488" w:history="1">
             <w:r>
               <w:rPr>
                 <w:rStyle w:val="Hyperlink"/>
@@ -1238,7 +1237,7 @@
               <w:rPr>
                 <w:noProof/>
               </w:rPr>
-              <w:instrText xml:space="preserve"> PAGEREF _Toc241000379 \h </w:instrText>
+              <w:instrText xml:space="preserve"> PAGEREF _Toc241000488 \h </w:instrText>
             </w:r>
             <w:r>
               <w:rPr>
@@ -1281,7 +1280,7 @@
               <w14:ligatures w14:val="standardContextual"/>
             </w:rPr>
           </w:pPr>
-          <w:hyperlink w:anchor="_Toc241000380" w:history="1">
+          <w:hyperlink w:anchor="_Toc241000489" w:history="1">
             <w:r>
               <w:rPr>
                 <w:rStyle w:val="Hyperlink"/>
@@ -1305,7 +1304,7 @@
               <w:rPr>
                 <w:noProof/>
               </w:rPr>
-              <w:instrText xml:space="preserve"> PAGEREF _Toc241000380 \h </w:instrText>
+              <w:instrText xml:space="preserve"> PAGEREF _Toc241000489 \h </w:instrText>
             </w:r>
             <w:r>
               <w:rPr>
@@ -1348,7 +1347,7 @@
               <w14:ligatures w14:val="standardContextual"/>
             </w:rPr>
           </w:pPr>
-          <w:hyperlink w:anchor="_Toc241000381" w:history="1">
+          <w:hyperlink w:anchor="_Toc241000490" w:history="1">
             <w:r>
               <w:rPr>
                 <w:rStyle w:val="Hyperlink"/>
@@ -1372,7 +1371,7 @@
               <w:rPr>
                 <w:noProof/>
               </w:rPr>
-              <w:instrText xml:space="preserve"> PAGEREF _Toc241000381 \h </w:instrText>
+              <w:instrText xml:space="preserve"> PAGEREF _Toc241000490 \h </w:instrText>
             </w:r>
             <w:r>
               <w:rPr>
@@ -1415,7 +1414,7 @@
               <w14:ligatures w14:val="standardContextual"/>
             </w:rPr>
           </w:pPr>
-          <w:hyperlink w:anchor="_Toc241000382" w:history="1">
+          <w:hyperlink w:anchor="_Toc241000491" w:history="1">
             <w:r>
               <w:rPr>
                 <w:rStyle w:val="Hyperlink"/>
@@ -1439,7 +1438,7 @@
               <w:rPr>
                 <w:noProof/>
               </w:rPr>
-              <w:instrText xml:space="preserve"> PAGEREF _Toc241000382 \h </w:instrText>
+              <w:instrText xml:space="preserve"> PAGEREF _Toc241000491 \h </w:instrText>
             </w:r>
             <w:r>
               <w:rPr>
@@ -1482,7 +1481,7 @@
               <w14:ligatures w14:val="standardContextual"/>
             </w:rPr>
           </w:pPr>
-          <w:hyperlink w:anchor="_Toc241000383" w:history="1">
+          <w:hyperlink w:anchor="_Toc241000492" w:history="1">
             <w:r>
               <w:rPr>
                 <w:rStyle w:val="Hyperlink"/>
@@ -1506,7 +1505,7 @@
               <w:rPr>
                 <w:noProof/>
               </w:rPr>
-              <w:instrText xml:space="preserve"> PAGEREF _Toc241000383 \h </w:instrText>
+              <w:instrText xml:space="preserve"> PAGEREF _Toc241000492 \h </w:instrText>
             </w:r>
             <w:r>
               <w:rPr>
@@ -1549,7 +1548,7 @@
               <w14:ligatures w14:val="standardContextual"/>
             </w:rPr>
           </w:pPr>
-          <w:hyperlink w:anchor="_Toc241000384" w:history="1">
+          <w:hyperlink w:anchor="_Toc241000493" w:history="1">
             <w:r>
               <w:rPr>
                 <w:rStyle w:val="Hyperlink"/>
@@ -1573,7 +1572,7 @@
               <w:rPr>
                 <w:noProof/>
               </w:rPr>
-              <w:instrText xml:space="preserve"> PAGEREF _Toc241000384 \h </w:instrText>
+              <w:instrText xml:space="preserve"> PAGEREF _Toc241000493 \h </w:instrText>
             </w:r>
             <w:r>
               <w:rPr>
@@ -1616,7 +1615,7 @@
               <w14:ligatures w14:val="standardContextual"/>
             </w:rPr>
           </w:pPr>
-          <w:hyperlink w:anchor="_Toc241000385" w:history="1">
+          <w:hyperlink w:anchor="_Toc241000494" w:history="1">
             <w:r>
               <w:rPr>
                 <w:rStyle w:val="Hyperlink"/>
@@ -1640,7 +1639,7 @@
               <w:rPr>
                 <w:noProof/>
               </w:rPr>
-              <w:instrText xml:space="preserve"> PAGEREF _Toc241000385 \h </w:instrText>
+              <w:instrText xml:space="preserve"> PAGEREF _Toc241000494 \h </w:instrText>
             </w:r>
             <w:r>
               <w:rPr>
@@ -1683,7 +1682,7 @@
               <w14:ligatures w14:val="standardContextual"/>
             </w:rPr>
           </w:pPr>
-          <w:hyperlink w:anchor="_Toc241000386" w:history="1">
+          <w:hyperlink w:anchor="_Toc241000495" w:history="1">
             <w:r>
               <w:rPr>
                 <w:rStyle w:val="Hyperlink"/>
@@ -1707,7 +1706,7 @@
               <w:rPr>
                 <w:noProof/>
               </w:rPr>
-              <w:instrText xml:space="preserve"> PAGEREF _Toc241000386 \h </w:instrText>
+              <w:instrText xml:space="preserve"> PAGEREF _Toc241000495 \h </w:instrText>
             </w:r>
             <w:r>
               <w:rPr>
@@ -1750,7 +1749,7 @@
               <w14:ligatures w14:val="standardContextual"/>
             </w:rPr>
           </w:pPr>
-          <w:hyperlink w:anchor="_Toc241000387" w:history="1">
+          <w:hyperlink w:anchor="_Toc241000496" w:history="1">
             <w:r>
               <w:rPr>
                 <w:rStyle w:val="Hyperlink"/>
@@ -1774,7 +1773,7 @@
               <w:rPr>
                 <w:noProof/>
               </w:rPr>
-              <w:instrText xml:space="preserve"> PAGEREF _Toc241000387 \h </w:instrText>
+              <w:instrText xml:space="preserve"> PAGEREF _Toc241000496 \h </w:instrText>
             </w:r>
             <w:r>
               <w:rPr>
@@ -1817,7 +1816,7 @@
               <w14:ligatures w14:val="standardContextual"/>
             </w:rPr>
           </w:pPr>
-          <w:hyperlink w:anchor="_Toc241000388" w:history="1">
+          <w:hyperlink w:anchor="_Toc241000497" w:history="1">
             <w:r>
               <w:rPr>
                 <w:rStyle w:val="Hyperlink"/>
@@ -1841,7 +1840,7 @@
               <w:rPr>
                 <w:noProof/>
               </w:rPr>
-              <w:instrText xml:space="preserve"> PAGEREF _Toc241000388 \h </w:instrText>
+              <w:instrText xml:space="preserve"> PAGEREF _Toc241000497 \h </w:instrText>
             </w:r>
             <w:r>
               <w:rPr>
@@ -1884,7 +1883,7 @@
               <w14:ligatures w14:val="standardContextual"/>
             </w:rPr>
           </w:pPr>
-          <w:hyperlink w:anchor="_Toc241000389" w:history="1">
+          <w:hyperlink w:anchor="_Toc241000498" w:history="1">
             <w:r>
               <w:rPr>
                 <w:rStyle w:val="Hyperlink"/>
@@ -1908,7 +1907,7 @@
               <w:rPr>
                 <w:noProof/>
               </w:rPr>
-              <w:instrText xml:space="preserve"> PAGEREF _Toc241000389 \h </w:instrText>
+              <w:instrText xml:space="preserve"> PAGEREF _Toc241000498 \h </w:instrText>
             </w:r>
             <w:r>
               <w:rPr>
@@ -1951,7 +1950,7 @@
               <w14:ligatures w14:val="standardContextual"/>
             </w:rPr>
           </w:pPr>
-          <w:hyperlink w:anchor="_Toc241000390" w:history="1">
+          <w:hyperlink w:anchor="_Toc241000499" w:history="1">
             <w:r>
               <w:rPr>
                 <w:rStyle w:val="Hyperlink"/>
@@ -1975,7 +1974,7 @@
               <w:rPr>
                 <w:noProof/>
               </w:rPr>
-              <w:instrText xml:space="preserve"> PAGEREF _Toc241000390 \h </w:instrText>
+              <w:instrText xml:space="preserve"> PAGEREF _Toc241000499 \h </w:instrText>
             </w:r>
             <w:r>
               <w:rPr>
@@ -2018,7 +2017,7 @@
               <w14:ligatures w14:val="standardContextual"/>
             </w:rPr>
           </w:pPr>
-          <w:hyperlink w:anchor="_Toc241000391" w:history="1">
+          <w:hyperlink w:anchor="_Toc241000500" w:history="1">
             <w:r>
               <w:rPr>
                 <w:rStyle w:val="Hyperlink"/>
@@ -2042,7 +2041,7 @@
               <w:rPr>
                 <w:noProof/>
               </w:rPr>
-              <w:instrText xml:space="preserve"> PAGEREF _Toc241000391 \h </w:instrText>
+              <w:instrText xml:space="preserve"> PAGEREF _Toc241000500 \h </w:instrText>
             </w:r>
             <w:r>
               <w:rPr>
@@ -2085,7 +2084,7 @@
               <w14:ligatures w14:val="standardContextual"/>
             </w:rPr>
           </w:pPr>
-          <w:hyperlink w:anchor="_Toc241000392" w:history="1">
+          <w:hyperlink w:anchor="_Toc241000501" w:history="1">
             <w:r>
               <w:rPr>
                 <w:rStyle w:val="Hyperlink"/>
@@ -2109,7 +2108,7 @@
               <w:rPr>
                 <w:noProof/>
               </w:rPr>
-              <w:instrText xml:space="preserve"> PAGEREF _Toc241000392 \h </w:instrText>
+              <w:instrText xml:space="preserve"> PAGEREF _Toc241000501 \h </w:instrText>
             </w:r>
             <w:r>
               <w:rPr>
@@ -2152,7 +2151,7 @@
               <w14:ligatures w14:val="standardContextual"/>
             </w:rPr>
           </w:pPr>
-          <w:hyperlink w:anchor="_Toc241000393" w:history="1">
+          <w:hyperlink w:anchor="_Toc241000502" w:history="1">
             <w:r>
               <w:rPr>
                 <w:rStyle w:val="Hyperlink"/>
@@ -2176,7 +2175,7 @@
               <w:rPr>
                 <w:noProof/>
               </w:rPr>
-              <w:instrText xml:space="preserve"> PAGEREF _Toc241000393 \h </w:instrText>
+              <w:instrText xml:space="preserve"> PAGEREF _Toc241000502 \h </w:instrText>
             </w:r>
             <w:r>
               <w:rPr>
@@ -2219,7 +2218,7 @@
               <w14:ligatures w14:val="standardContextual"/>
             </w:rPr>
           </w:pPr>
-          <w:hyperlink w:anchor="_Toc241000394" w:history="1">
+          <w:hyperlink w:anchor="_Toc241000503" w:history="1">
             <w:r>
               <w:rPr>
                 <w:rStyle w:val="Hyperlink"/>
@@ -2243,7 +2242,7 @@
               <w:rPr>
                 <w:noProof/>
               </w:rPr>
-              <w:instrText xml:space="preserve"> PAGEREF _Toc241000394 \h </w:instrText>
+              <w:instrText xml:space="preserve"> PAGEREF _Toc241000503 \h </w:instrText>
             </w:r>
             <w:r>
               <w:rPr>
@@ -2286,7 +2285,7 @@
               <w14:ligatures w14:val="standardContextual"/>
             </w:rPr>
           </w:pPr>
-          <w:hyperlink w:anchor="_Toc241000395" w:history="1">
+          <w:hyperlink w:anchor="_Toc241000504" w:history="1">
             <w:r>
               <w:rPr>
                 <w:rStyle w:val="Hyperlink"/>
@@ -2310,7 +2309,7 @@
               <w:rPr>
                 <w:noProof/>
               </w:rPr>
-              <w:instrText xml:space="preserve"> PAGEREF _Toc241000395 \h </w:instrText>
+              <w:instrText xml:space="preserve"> PAGEREF _Toc241000504 \h </w:instrText>
             </w:r>
             <w:r>
               <w:rPr>
@@ -2350,9 +2349,8 @@
         <w:keepNext/>
         <w:pageBreakBefore/>
       </w:pPr>
-      <w:bookmarkStart w:id="0" w:name="_Toc241000364"/>
-      <w:r>
-        <w:lastRenderedPageBreak/>
+      <w:bookmarkStart w:id="0" w:name="_Toc241000473"/>
+      <w:r>
         <w:t>1. Introduction</w:t>
       </w:r>
       <w:bookmarkEnd w:id="0"/>
@@ -2362,7 +2360,7 @@
         <w:pStyle w:val="Heading2"/>
         <w:keepNext/>
       </w:pPr>
-      <w:bookmarkStart w:id="1" w:name="_Toc241000365"/>
+      <w:bookmarkStart w:id="1" w:name="_Toc241000474"/>
       <w:r>
         <w:t>1.1 Why FareLens</w:t>
       </w:r>
@@ -2460,10 +2458,95 @@
         <w:spacing w:after="120"/>
       </w:pPr>
       <w:r>
-        <w:t xml:space="preserve">If you consume airline content through a GDS (TravelSwitch runs on Amadeus) you will have met this: in NDC flows the fare-family / price-class descriptions and fare rules are passed through exactly as the airline supplies them. There is no GDS-generated short text (unlike EDIFACT), no parameter to control the length, and no standardisation across carriers. The result is long, inconsistent text blocks, often with detailed conditions or URLs embedded, that are unusable in a B2C booking flow. When raised with </w:t>
-      </w:r>
-      <w:r>
-        <w:t>the GDS, the position is that this behaviour is by design and compliant with the NDC standard, which means the integrator has to solve it.</w:t>
+        <w:t>If you consume airline content through a GDS (TravelSwitch runs on Amadeus), you will have hit this in NDC flows:</w:t>
+      </w:r>
+    </w:p>
+    <w:p>
+      <w:pPr>
+        <w:pStyle w:val="ListParagraph"/>
+        <w:numPr>
+          <w:ilvl w:val="0"/>
+          <w:numId w:val="2"/>
+        </w:numPr>
+        <w:spacing w:after="60"/>
+      </w:pPr>
+      <w:r>
+        <w:rPr>
+          <w:b/>
+          <w:bCs/>
+        </w:rPr>
+        <w:t>Fare-family, price-class and fare-rule text is passed through exactly as the airline supplies it.</w:t>
+      </w:r>
+      <w:r>
+        <w:t xml:space="preserve"> The GDS does not generate a short version the way it does for EDIFACT.</w:t>
+      </w:r>
+    </w:p>
+    <w:p>
+      <w:pPr>
+        <w:pStyle w:val="ListParagraph"/>
+        <w:numPr>
+          <w:ilvl w:val="0"/>
+          <w:numId w:val="2"/>
+        </w:numPr>
+        <w:spacing w:after="60"/>
+      </w:pPr>
+      <w:r>
+        <w:rPr>
+          <w:b/>
+          <w:bCs/>
+        </w:rPr>
+        <w:t>There is no parameter to control the length</w:t>
+      </w:r>
+      <w:r>
+        <w:t>, and no standardisation across carriers.</w:t>
+      </w:r>
+    </w:p>
+    <w:p>
+      <w:pPr>
+        <w:pStyle w:val="ListParagraph"/>
+        <w:numPr>
+          <w:ilvl w:val="0"/>
+          <w:numId w:val="2"/>
+        </w:numPr>
+        <w:spacing w:after="60"/>
+      </w:pPr>
+      <w:r>
+        <w:rPr>
+          <w:b/>
+          <w:bCs/>
+        </w:rPr>
+        <w:t>The text is often long and inconsistent</w:t>
+      </w:r>
+      <w:r>
+        <w:t>, with detailed conditions or URLs embedded, which makes it unusable in a B2C booking flow.</w:t>
+      </w:r>
+    </w:p>
+    <w:p>
+      <w:pPr>
+        <w:pStyle w:val="ListParagraph"/>
+        <w:numPr>
+          <w:ilvl w:val="0"/>
+          <w:numId w:val="2"/>
+        </w:numPr>
+        <w:spacing w:after="60"/>
+      </w:pPr>
+      <w:r>
+        <w:rPr>
+          <w:b/>
+          <w:bCs/>
+        </w:rPr>
+        <w:t>This is by design.</w:t>
+      </w:r>
+      <w:r>
+        <w:t xml:space="preserve"> When raised with the GDS, the position is that the behaviour is compliant with the NDC standard, so the integrator has to solve it.</w:t>
+      </w:r>
+    </w:p>
+    <w:p>
+      <w:pPr>
+        <w:spacing w:before="120" w:after="120"/>
+      </w:pPr>
+      <w:r>
+        <w:t>FareLens is that solution. Feed it whatever the airline returned and get back a consistent, short, structured summary, plus a Q&amp;A channel for the follow-up questions travellers actually ask.</w:t>
       </w:r>
     </w:p>
     <w:p>
@@ -2471,7 +2554,7 @@
         <w:spacing w:after="120"/>
       </w:pPr>
       <w:r>
-        <w:t>FareLens is that solution: feed it whatever the airline returned and get back a consistent, short, structured summary, plus a Q&amp;A channel for the follow-up questions travellers actually ask. It is content-source agnostic: Amadeus, Sabre, Travelport, direct-connect NDC or an airline API all produce the same clean output.</w:t>
+        <w:t>It is content-source agnostic: Amadeus, Sabre, Travelport, direct-connect NDC or an airline API all produce the same clean output.</w:t>
       </w:r>
     </w:p>
     <w:p>
@@ -2479,7 +2562,7 @@
         <w:pStyle w:val="Heading2"/>
         <w:keepNext/>
       </w:pPr>
-      <w:bookmarkStart w:id="2" w:name="_Toc241000366"/>
+      <w:bookmarkStart w:id="2" w:name="_Toc241000475"/>
       <w:r>
         <w:t>1.2 What you get</w:t>
       </w:r>
@@ -3022,9 +3105,8 @@
         <w:pStyle w:val="Heading2"/>
         <w:keepNext/>
       </w:pPr>
-      <w:bookmarkStart w:id="3" w:name="_Toc241000367"/>
-      <w:r>
-        <w:lastRenderedPageBreak/>
+      <w:bookmarkStart w:id="3" w:name="_Toc241000476"/>
+      <w:r>
         <w:t>1.3 The admin interface at a glance</w:t>
       </w:r>
       <w:bookmarkEnd w:id="3"/>
@@ -3040,10 +3122,10 @@
           <w:noProof/>
         </w:rPr>
         <w:drawing>
-          <wp:inline distT="0" distB="0" distL="0" distR="0" wp14:anchorId="6CEF0787" wp14:editId="2900B3AA">
+          <wp:inline distT="0" distB="0" distL="0" distR="0" wp14:anchorId="070E70B1" wp14:editId="5005DFA9">
             <wp:extent cx="6400800" cy="4000500"/>
             <wp:effectExtent l="0" t="0" r="0" b="0"/>
-            <wp:docPr id="599935438" name="Picture 599935438"/>
+            <wp:docPr id="1982919607" name="Picture 1982919607"/>
             <wp:cNvGraphicFramePr>
               <a:graphicFrameLocks xmlns:a="http://schemas.openxmlformats.org/drawingml/2006/main" noChangeAspect="1"/>
             </wp:cNvGraphicFramePr>
@@ -3101,9 +3183,8 @@
         <w:keepNext/>
         <w:pageBreakBefore/>
       </w:pPr>
-      <w:bookmarkStart w:id="4" w:name="_Toc241000368"/>
-      <w:r>
-        <w:lastRenderedPageBreak/>
+      <w:bookmarkStart w:id="4" w:name="_Toc241000477"/>
+      <w:r>
         <w:t>2. Quick start</w:t>
       </w:r>
       <w:bookmarkEnd w:id="4"/>
@@ -3121,7 +3202,7 @@
         <w:pStyle w:val="Heading2"/>
         <w:keepNext/>
       </w:pPr>
-      <w:bookmarkStart w:id="5" w:name="_Toc241000369"/>
+      <w:bookmarkStart w:id="5" w:name="_Toc241000478"/>
       <w:r>
         <w:t>2.1 Run it</w:t>
       </w:r>
@@ -3226,7 +3307,7 @@
         <w:pStyle w:val="Heading2"/>
         <w:keepNext/>
       </w:pPr>
-      <w:bookmarkStart w:id="6" w:name="_Toc241000370"/>
+      <w:bookmarkStart w:id="6" w:name="_Toc241000479"/>
       <w:r>
         <w:t>2.2 Choose an LLM provider</w:t>
       </w:r>
@@ -3271,10 +3352,10 @@
           <w:noProof/>
         </w:rPr>
         <w:drawing>
-          <wp:inline distT="0" distB="0" distL="0" distR="0" wp14:anchorId="1AF950B5" wp14:editId="699A0253">
+          <wp:inline distT="0" distB="0" distL="0" distR="0" wp14:anchorId="0C623A6D" wp14:editId="2F682DE2">
             <wp:extent cx="6400800" cy="4000500"/>
             <wp:effectExtent l="0" t="0" r="0" b="0"/>
-            <wp:docPr id="571140641" name="Picture 571140641"/>
+            <wp:docPr id="1113995304" name="Picture 1113995304"/>
             <wp:cNvGraphicFramePr>
               <a:graphicFrameLocks xmlns:a="http://schemas.openxmlformats.org/drawingml/2006/main" noChangeAspect="1"/>
             </wp:cNvGraphicFramePr>
@@ -3331,7 +3412,7 @@
         <w:pStyle w:val="Heading2"/>
         <w:keepNext/>
       </w:pPr>
-      <w:bookmarkStart w:id="7" w:name="_Toc241000371"/>
+      <w:bookmarkStart w:id="7" w:name="_Toc241000480"/>
       <w:r>
         <w:t>2.3 Create an API key</w:t>
       </w:r>
@@ -3355,12 +3436,11 @@
         <w:rPr>
           <w:noProof/>
         </w:rPr>
-        <w:lastRenderedPageBreak/>
         <w:drawing>
-          <wp:inline distT="0" distB="0" distL="0" distR="0" wp14:anchorId="54580A6F" wp14:editId="50952DD3">
+          <wp:inline distT="0" distB="0" distL="0" distR="0" wp14:anchorId="4AB4F91D" wp14:editId="1BC5A85A">
             <wp:extent cx="6400800" cy="4000500"/>
             <wp:effectExtent l="0" t="0" r="0" b="0"/>
-            <wp:docPr id="1768694640" name="Picture 1768694640"/>
+            <wp:docPr id="1428262257" name="Picture 1428262257"/>
             <wp:cNvGraphicFramePr>
               <a:graphicFrameLocks xmlns:a="http://schemas.openxmlformats.org/drawingml/2006/main" noChangeAspect="1"/>
             </wp:cNvGraphicFramePr>
@@ -3417,7 +3497,7 @@
         <w:pStyle w:val="Heading2"/>
         <w:keepNext/>
       </w:pPr>
-      <w:bookmarkStart w:id="8" w:name="_Toc241000372"/>
+      <w:bookmarkStart w:id="8" w:name="_Toc241000481"/>
       <w:r>
         <w:t>2.4 Call the API</w:t>
       </w:r>
@@ -3511,7 +3591,7 @@
         <w:pStyle w:val="Heading2"/>
         <w:keepNext/>
       </w:pPr>
-      <w:bookmarkStart w:id="9" w:name="_Toc241000373"/>
+      <w:bookmarkStart w:id="9" w:name="_Toc241000482"/>
       <w:r>
         <w:t>2.5 Try it in the Playground</w:t>
       </w:r>
@@ -3535,12 +3615,11 @@
         <w:rPr>
           <w:noProof/>
         </w:rPr>
-        <w:lastRenderedPageBreak/>
         <w:drawing>
-          <wp:inline distT="0" distB="0" distL="0" distR="0" wp14:anchorId="060BC7E8" wp14:editId="0D00B101">
+          <wp:inline distT="0" distB="0" distL="0" distR="0" wp14:anchorId="08D83DDF" wp14:editId="6ACA37D3">
             <wp:extent cx="6400800" cy="4000500"/>
             <wp:effectExtent l="0" t="0" r="0" b="0"/>
-            <wp:docPr id="1736373260" name="Picture 1736373260"/>
+            <wp:docPr id="1275995933" name="Picture 1275995933"/>
             <wp:cNvGraphicFramePr>
               <a:graphicFrameLocks xmlns:a="http://schemas.openxmlformats.org/drawingml/2006/main" noChangeAspect="1"/>
             </wp:cNvGraphicFramePr>
@@ -3603,10 +3682,10 @@
           <w:noProof/>
         </w:rPr>
         <w:drawing>
-          <wp:inline distT="0" distB="0" distL="0" distR="0" wp14:anchorId="6E931CCC" wp14:editId="1CC4A91C">
+          <wp:inline distT="0" distB="0" distL="0" distR="0" wp14:anchorId="6ACC931C" wp14:editId="453483F2">
             <wp:extent cx="6400800" cy="4000500"/>
             <wp:effectExtent l="0" t="0" r="0" b="0"/>
-            <wp:docPr id="1448665575" name="Picture 1448665575"/>
+            <wp:docPr id="1518840164" name="Picture 1518840164"/>
             <wp:cNvGraphicFramePr>
               <a:graphicFrameLocks xmlns:a="http://schemas.openxmlformats.org/drawingml/2006/main" noChangeAspect="1"/>
             </wp:cNvGraphicFramePr>
@@ -3663,9 +3742,8 @@
         <w:pStyle w:val="Heading2"/>
         <w:keepNext/>
       </w:pPr>
-      <w:bookmarkStart w:id="10" w:name="_Toc241000374"/>
-      <w:r>
-        <w:lastRenderedPageBreak/>
+      <w:bookmarkStart w:id="10" w:name="_Toc241000483"/>
+      <w:r>
         <w:t>2.6 Watch usage</w:t>
       </w:r>
       <w:bookmarkEnd w:id="10"/>
@@ -3689,10 +3767,10 @@
           <w:noProof/>
         </w:rPr>
         <w:drawing>
-          <wp:inline distT="0" distB="0" distL="0" distR="0" wp14:anchorId="3F985955" wp14:editId="52A7FAA1">
+          <wp:inline distT="0" distB="0" distL="0" distR="0" wp14:anchorId="0AB6AE9D" wp14:editId="1D556C64">
             <wp:extent cx="6400800" cy="6143625"/>
             <wp:effectExtent l="0" t="0" r="0" b="0"/>
-            <wp:docPr id="1144019833" name="Picture 1144019833"/>
+            <wp:docPr id="1307791038" name="Picture 1307791038"/>
             <wp:cNvGraphicFramePr>
               <a:graphicFrameLocks xmlns:a="http://schemas.openxmlformats.org/drawingml/2006/main" noChangeAspect="1"/>
             </wp:cNvGraphicFramePr>
@@ -3750,9 +3828,8 @@
         <w:keepNext/>
         <w:pageBreakBefore/>
       </w:pPr>
-      <w:bookmarkStart w:id="11" w:name="_Toc241000375"/>
-      <w:r>
-        <w:lastRenderedPageBreak/>
+      <w:bookmarkStart w:id="11" w:name="_Toc241000484"/>
+      <w:r>
         <w:t>3. API reference</w:t>
       </w:r>
       <w:bookmarkEnd w:id="11"/>
@@ -3762,7 +3839,7 @@
         <w:pStyle w:val="Heading2"/>
         <w:keepNext/>
       </w:pPr>
-      <w:bookmarkStart w:id="12" w:name="_Toc241000376"/>
+      <w:bookmarkStart w:id="12" w:name="_Toc241000485"/>
       <w:r>
         <w:t>3.1 Authentication and errors</w:t>
       </w:r>
@@ -4470,7 +4547,7 @@
         <w:pStyle w:val="Heading2"/>
         <w:keepNext/>
       </w:pPr>
-      <w:bookmarkStart w:id="13" w:name="_Toc241000377"/>
+      <w:bookmarkStart w:id="13" w:name="_Toc241000486"/>
       <w:r>
         <w:t>3.2 POST /api/v1/fare-rules/summary</w:t>
       </w:r>
@@ -5105,9 +5182,8 @@
         <w:pStyle w:val="Heading2"/>
         <w:keepNext/>
       </w:pPr>
-      <w:bookmarkStart w:id="14" w:name="_Toc241000378"/>
-      <w:r>
-        <w:lastRenderedPageBreak/>
+      <w:bookmarkStart w:id="14" w:name="_Toc241000487"/>
+      <w:r>
         <w:t>3.3 POST /api/v1/fare-rules/chat/stream</w:t>
       </w:r>
       <w:bookmarkEnd w:id="14"/>
@@ -5461,7 +5537,7 @@
         <w:pStyle w:val="Heading2"/>
         <w:keepNext/>
       </w:pPr>
-      <w:bookmarkStart w:id="15" w:name="_Toc241000379"/>
+      <w:bookmarkStart w:id="15" w:name="_Toc241000488"/>
       <w:r>
         <w:t>3.4 Other endpoints</w:t>
       </w:r>
@@ -5809,7 +5885,7 @@
         <w:pStyle w:val="Heading2"/>
         <w:keepNext/>
       </w:pPr>
-      <w:bookmarkStart w:id="16" w:name="_Toc241000380"/>
+      <w:bookmarkStart w:id="16" w:name="_Toc241000489"/>
       <w:r>
         <w:t>3.5 Interactive documentation (Swagger UI)</w:t>
       </w:r>
@@ -5872,12 +5948,11 @@
         <w:rPr>
           <w:noProof/>
         </w:rPr>
-        <w:lastRenderedPageBreak/>
         <w:drawing>
-          <wp:inline distT="0" distB="0" distL="0" distR="0" wp14:anchorId="1146C9C8" wp14:editId="63B7C895">
+          <wp:inline distT="0" distB="0" distL="0" distR="0" wp14:anchorId="712C0A5F" wp14:editId="4196DABE">
             <wp:extent cx="6400800" cy="5553075"/>
             <wp:effectExtent l="0" t="0" r="0" b="0"/>
-            <wp:docPr id="995216862" name="Picture 995216862"/>
+            <wp:docPr id="647628897" name="Picture 647628897"/>
             <wp:cNvGraphicFramePr>
               <a:graphicFrameLocks xmlns:a="http://schemas.openxmlformats.org/drawingml/2006/main" noChangeAspect="1"/>
             </wp:cNvGraphicFramePr>
@@ -5939,12 +6014,11 @@
         <w:rPr>
           <w:noProof/>
         </w:rPr>
-        <w:lastRenderedPageBreak/>
         <w:drawing>
-          <wp:inline distT="0" distB="0" distL="0" distR="0" wp14:anchorId="1C96EE8C" wp14:editId="654A3258">
+          <wp:inline distT="0" distB="0" distL="0" distR="0" wp14:anchorId="53528B28" wp14:editId="20B15919">
             <wp:extent cx="4505325" cy="7429500"/>
             <wp:effectExtent l="0" t="0" r="0" b="0"/>
-            <wp:docPr id="1287932157" name="Picture 1287932157"/>
+            <wp:docPr id="1204415141" name="Picture 1204415141"/>
             <wp:cNvGraphicFramePr>
               <a:graphicFrameLocks xmlns:a="http://schemas.openxmlformats.org/drawingml/2006/main" noChangeAspect="1"/>
             </wp:cNvGraphicFramePr>
@@ -6002,9 +6076,8 @@
         <w:keepNext/>
         <w:pageBreakBefore/>
       </w:pPr>
-      <w:bookmarkStart w:id="17" w:name="_Toc241000381"/>
-      <w:r>
-        <w:lastRenderedPageBreak/>
+      <w:bookmarkStart w:id="17" w:name="_Toc241000490"/>
+      <w:r>
         <w:t>4. Configuration</w:t>
       </w:r>
       <w:bookmarkEnd w:id="17"/>
@@ -6048,7 +6121,7 @@
         <w:pStyle w:val="Heading2"/>
         <w:keepNext/>
       </w:pPr>
-      <w:bookmarkStart w:id="18" w:name="_Toc241000382"/>
+      <w:bookmarkStart w:id="18" w:name="_Toc241000491"/>
       <w:r>
         <w:t>4.1 Environment variables</w:t>
       </w:r>
@@ -7289,7 +7362,7 @@
         <w:pStyle w:val="Heading2"/>
         <w:keepNext/>
       </w:pPr>
-      <w:bookmarkStart w:id="19" w:name="_Toc241000383"/>
+      <w:bookmarkStart w:id="19" w:name="_Toc241000492"/>
       <w:r>
         <w:t>4.2 LLM providers</w:t>
       </w:r>
@@ -7950,9 +8023,8 @@
         <w:pStyle w:val="Heading2"/>
         <w:keepNext/>
       </w:pPr>
-      <w:bookmarkStart w:id="20" w:name="_Toc241000384"/>
-      <w:r>
-        <w:lastRenderedPageBreak/>
+      <w:bookmarkStart w:id="20" w:name="_Toc241000493"/>
+      <w:r>
         <w:t>4.3 Using your own Postgres / Redis</w:t>
       </w:r>
       <w:bookmarkEnd w:id="20"/>
@@ -7986,10 +8058,10 @@
           <w:noProof/>
         </w:rPr>
         <w:drawing>
-          <wp:inline distT="0" distB="0" distL="0" distR="0" wp14:anchorId="6A7A50BA" wp14:editId="7177EBF3">
+          <wp:inline distT="0" distB="0" distL="0" distR="0" wp14:anchorId="4EB3C635" wp14:editId="61C7CCF2">
             <wp:extent cx="6400800" cy="4000500"/>
             <wp:effectExtent l="0" t="0" r="0" b="0"/>
-            <wp:docPr id="605279551" name="Picture 605279551"/>
+            <wp:docPr id="802490175" name="Picture 802490175"/>
             <wp:cNvGraphicFramePr>
               <a:graphicFrameLocks xmlns:a="http://schemas.openxmlformats.org/drawingml/2006/main" noChangeAspect="1"/>
             </wp:cNvGraphicFramePr>
@@ -8046,7 +8118,7 @@
         <w:pStyle w:val="Heading2"/>
         <w:keepNext/>
       </w:pPr>
-      <w:bookmarkStart w:id="21" w:name="_Toc241000385"/>
+      <w:bookmarkStart w:id="21" w:name="_Toc241000494"/>
       <w:r>
         <w:t>4.4 Prompts</w:t>
       </w:r>
@@ -8080,12 +8152,11 @@
         <w:rPr>
           <w:noProof/>
         </w:rPr>
-        <w:lastRenderedPageBreak/>
         <w:drawing>
-          <wp:inline distT="0" distB="0" distL="0" distR="0" wp14:anchorId="20A3B733" wp14:editId="43B7E4FC">
+          <wp:inline distT="0" distB="0" distL="0" distR="0" wp14:anchorId="490E5D1E" wp14:editId="471735BE">
             <wp:extent cx="6400800" cy="4000500"/>
             <wp:effectExtent l="0" t="0" r="0" b="0"/>
-            <wp:docPr id="449810974" name="Picture 449810974"/>
+            <wp:docPr id="1292826444" name="Picture 1292826444"/>
             <wp:cNvGraphicFramePr>
               <a:graphicFrameLocks xmlns:a="http://schemas.openxmlformats.org/drawingml/2006/main" noChangeAspect="1"/>
             </wp:cNvGraphicFramePr>
@@ -8216,9 +8287,8 @@
         <w:keepNext/>
         <w:pageBreakBefore/>
       </w:pPr>
-      <w:bookmarkStart w:id="22" w:name="_Toc241000386"/>
-      <w:r>
-        <w:lastRenderedPageBreak/>
+      <w:bookmarkStart w:id="22" w:name="_Toc241000495"/>
+      <w:r>
         <w:t>5. Architecture</w:t>
       </w:r>
       <w:bookmarkEnd w:id="22"/>
@@ -8228,7 +8298,7 @@
         <w:pStyle w:val="Heading2"/>
         <w:keepNext/>
       </w:pPr>
-      <w:bookmarkStart w:id="23" w:name="_Toc241000387"/>
+      <w:bookmarkStart w:id="23" w:name="_Toc241000496"/>
       <w:r>
         <w:t>5.1 Request flow</w:t>
       </w:r>
@@ -8239,7 +8309,7 @@
         <w:pStyle w:val="ListParagraph"/>
         <w:numPr>
           <w:ilvl w:val="0"/>
-          <w:numId w:val="2"/>
+          <w:numId w:val="3"/>
         </w:numPr>
         <w:spacing w:after="80"/>
       </w:pPr>
@@ -8265,7 +8335,7 @@
         <w:pStyle w:val="ListParagraph"/>
         <w:numPr>
           <w:ilvl w:val="0"/>
-          <w:numId w:val="2"/>
+          <w:numId w:val="3"/>
         </w:numPr>
         <w:spacing w:after="80"/>
       </w:pPr>
@@ -8278,7 +8348,7 @@
         <w:pStyle w:val="ListParagraph"/>
         <w:numPr>
           <w:ilvl w:val="0"/>
-          <w:numId w:val="2"/>
+          <w:numId w:val="3"/>
         </w:numPr>
         <w:spacing w:after="80"/>
       </w:pPr>
@@ -8317,7 +8387,7 @@
         <w:pStyle w:val="ListParagraph"/>
         <w:numPr>
           <w:ilvl w:val="0"/>
-          <w:numId w:val="2"/>
+          <w:numId w:val="3"/>
         </w:numPr>
         <w:spacing w:after="80"/>
       </w:pPr>
@@ -8330,7 +8400,7 @@
         <w:pStyle w:val="ListParagraph"/>
         <w:numPr>
           <w:ilvl w:val="0"/>
-          <w:numId w:val="2"/>
+          <w:numId w:val="3"/>
         </w:numPr>
         <w:spacing w:after="80"/>
       </w:pPr>
@@ -8351,7 +8421,7 @@
         <w:pStyle w:val="Heading2"/>
         <w:keepNext/>
       </w:pPr>
-      <w:bookmarkStart w:id="24" w:name="_Toc241000388"/>
+      <w:bookmarkStart w:id="24" w:name="_Toc241000497"/>
       <w:r>
         <w:t>5.2 Code layout</w:t>
       </w:r>
@@ -8517,7 +8587,7 @@
         <w:pStyle w:val="Heading2"/>
         <w:keepNext/>
       </w:pPr>
-      <w:bookmarkStart w:id="25" w:name="_Toc241000389"/>
+      <w:bookmarkStart w:id="25" w:name="_Toc241000498"/>
       <w:r>
         <w:t>5.3 Technology</w:t>
       </w:r>
@@ -8913,9 +8983,8 @@
         <w:keepNext/>
         <w:pageBreakBefore/>
       </w:pPr>
-      <w:bookmarkStart w:id="26" w:name="_Toc241000390"/>
-      <w:r>
-        <w:lastRenderedPageBreak/>
+      <w:bookmarkStart w:id="26" w:name="_Toc241000499"/>
+      <w:r>
         <w:t>6. Deployment</w:t>
       </w:r>
       <w:bookmarkEnd w:id="26"/>
@@ -8925,321 +8994,11 @@
         <w:pStyle w:val="Heading2"/>
         <w:keepNext/>
       </w:pPr>
-      <w:bookmarkStart w:id="27" w:name="_Toc241000391"/>
+      <w:bookmarkStart w:id="27" w:name="_Toc241000500"/>
       <w:r>
         <w:t>6.1 Production checklist</w:t>
       </w:r>
       <w:bookmarkEnd w:id="27"/>
-    </w:p>
-    <w:p>
-      <w:pPr>
-        <w:pStyle w:val="ListParagraph"/>
-        <w:numPr>
-          <w:ilvl w:val="0"/>
-          <w:numId w:val="3"/>
-        </w:numPr>
-        <w:spacing w:after="60"/>
-      </w:pPr>
-      <w:r>
-        <w:t xml:space="preserve">Set </w:t>
-      </w:r>
-      <w:r>
-        <w:rPr>
-          <w:rFonts w:ascii="Consolas" w:eastAsia="Consolas" w:hAnsi="Consolas" w:cs="Consolas"/>
-          <w:color w:val="442690"/>
-          <w:sz w:val="20"/>
-          <w:szCs w:val="20"/>
-          <w:shd w:val="clear" w:color="auto" w:fill="F6F4FF"/>
-        </w:rPr>
-        <w:t>APP_SECRET_KEY</w:t>
-      </w:r>
-      <w:r>
-        <w:t xml:space="preserve"> to a long random value and never change it afterwards (it encrypts stored credentials).</w:t>
-      </w:r>
-    </w:p>
-    <w:p>
-      <w:pPr>
-        <w:pStyle w:val="ListParagraph"/>
-        <w:numPr>
-          <w:ilvl w:val="0"/>
-          <w:numId w:val="3"/>
-        </w:numPr>
-        <w:spacing w:after="60"/>
-      </w:pPr>
-      <w:r>
-        <w:t>Change the admin password (Account → Change password).</w:t>
-      </w:r>
-    </w:p>
-    <w:p>
-      <w:pPr>
-        <w:pStyle w:val="ListParagraph"/>
-        <w:numPr>
-          <w:ilvl w:val="0"/>
-          <w:numId w:val="3"/>
-        </w:numPr>
-        <w:spacing w:after="60"/>
-      </w:pPr>
-      <w:r>
-        <w:t>Change the bundled Postgres password, or use your own Postgres.</w:t>
-      </w:r>
-    </w:p>
-    <w:p>
-      <w:pPr>
-        <w:pStyle w:val="ListParagraph"/>
-        <w:numPr>
-          <w:ilvl w:val="0"/>
-          <w:numId w:val="3"/>
-        </w:numPr>
-        <w:spacing w:after="60"/>
-      </w:pPr>
-      <w:r>
-        <w:t xml:space="preserve">Serve over HTTPS behind a reverse proxy; the session cookie becomes </w:t>
-      </w:r>
-      <w:r>
-        <w:rPr>
-          <w:rFonts w:ascii="Consolas" w:eastAsia="Consolas" w:hAnsi="Consolas" w:cs="Consolas"/>
-          <w:color w:val="442690"/>
-          <w:sz w:val="20"/>
-          <w:szCs w:val="20"/>
-          <w:shd w:val="clear" w:color="auto" w:fill="F6F4FF"/>
-        </w:rPr>
-        <w:t>Secure</w:t>
-      </w:r>
-      <w:r>
-        <w:t xml:space="preserve"> automatically.</w:t>
-      </w:r>
-    </w:p>
-    <w:p>
-      <w:pPr>
-        <w:pStyle w:val="ListParagraph"/>
-        <w:numPr>
-          <w:ilvl w:val="0"/>
-          <w:numId w:val="3"/>
-        </w:numPr>
-        <w:spacing w:after="60"/>
-      </w:pPr>
-      <w:r>
-        <w:t xml:space="preserve">Restrict </w:t>
-      </w:r>
-      <w:r>
-        <w:rPr>
-          <w:rFonts w:ascii="Consolas" w:eastAsia="Consolas" w:hAnsi="Consolas" w:cs="Consolas"/>
-          <w:color w:val="442690"/>
-          <w:sz w:val="20"/>
-          <w:szCs w:val="20"/>
-          <w:shd w:val="clear" w:color="auto" w:fill="F6F4FF"/>
-        </w:rPr>
-        <w:t>CORS_ALLOW_ORIGINS</w:t>
-      </w:r>
-      <w:r>
-        <w:t xml:space="preserve"> if browsers call the API directly.</w:t>
-      </w:r>
-    </w:p>
-    <w:p>
-      <w:pPr>
-        <w:pStyle w:val="ListParagraph"/>
-        <w:numPr>
-          <w:ilvl w:val="0"/>
-          <w:numId w:val="3"/>
-        </w:numPr>
-        <w:spacing w:after="60"/>
-      </w:pPr>
-      <w:r>
-        <w:t>Keep Postgres and Redis on the private network — the compose file does not publish their ports.</w:t>
-      </w:r>
-    </w:p>
-    <w:p>
-      <w:pPr>
-        <w:pStyle w:val="Heading2"/>
-        <w:keepNext/>
-      </w:pPr>
-      <w:bookmarkStart w:id="28" w:name="_Toc241000392"/>
-      <w:r>
-        <w:t>6.2 Reverse proxy</w:t>
-      </w:r>
-      <w:bookmarkEnd w:id="28"/>
-    </w:p>
-    <w:p>
-      <w:pPr>
-        <w:spacing w:after="120"/>
-      </w:pPr>
-      <w:r>
-        <w:t xml:space="preserve">FareLens listens on plain HTTP (port 8000) and honours </w:t>
-      </w:r>
-      <w:r>
-        <w:rPr>
-          <w:rFonts w:ascii="Consolas" w:eastAsia="Consolas" w:hAnsi="Consolas" w:cs="Consolas"/>
-          <w:color w:val="442690"/>
-          <w:sz w:val="20"/>
-          <w:szCs w:val="20"/>
-          <w:shd w:val="clear" w:color="auto" w:fill="F6F4FF"/>
-        </w:rPr>
-        <w:t>X-Forwarded-*</w:t>
-      </w:r>
-      <w:r>
-        <w:t xml:space="preserve"> headers. Server-Sent Events require response buffering to be </w:t>
-      </w:r>
-      <w:r>
-        <w:rPr>
-          <w:b/>
-          <w:bCs/>
-        </w:rPr>
-        <w:t>off</w:t>
-      </w:r>
-      <w:r>
-        <w:t xml:space="preserve"> on every proxy in the path.</w:t>
-      </w:r>
-    </w:p>
-    <w:p>
-      <w:pPr>
-        <w:shd w:val="clear" w:color="auto" w:fill="F3F0FB"/>
-        <w:spacing w:line="276" w:lineRule="auto"/>
-        <w:ind w:left="200" w:right="200"/>
-      </w:pPr>
-      <w:r>
-        <w:rPr>
-          <w:rFonts w:ascii="Consolas" w:eastAsia="Consolas" w:hAnsi="Consolas" w:cs="Consolas"/>
-          <w:sz w:val="18"/>
-          <w:szCs w:val="18"/>
-        </w:rPr>
-        <w:t># nginx</w:t>
-      </w:r>
-    </w:p>
-    <w:p>
-      <w:pPr>
-        <w:shd w:val="clear" w:color="auto" w:fill="F3F0FB"/>
-        <w:spacing w:line="276" w:lineRule="auto"/>
-        <w:ind w:left="200" w:right="200"/>
-      </w:pPr>
-      <w:r>
-        <w:rPr>
-          <w:rFonts w:ascii="Consolas" w:eastAsia="Consolas" w:hAnsi="Consolas" w:cs="Consolas"/>
-          <w:sz w:val="18"/>
-          <w:szCs w:val="18"/>
-        </w:rPr>
-        <w:t>location / {</w:t>
-      </w:r>
-    </w:p>
-    <w:p>
-      <w:pPr>
-        <w:shd w:val="clear" w:color="auto" w:fill="F3F0FB"/>
-        <w:spacing w:line="276" w:lineRule="auto"/>
-        <w:ind w:left="200" w:right="200"/>
-      </w:pPr>
-      <w:r>
-        <w:rPr>
-          <w:rFonts w:ascii="Consolas" w:eastAsia="Consolas" w:hAnsi="Consolas" w:cs="Consolas"/>
-          <w:sz w:val="18"/>
-          <w:szCs w:val="18"/>
-        </w:rPr>
-        <w:t xml:space="preserve">    proxy_pass http://127.0.0.1:8000;</w:t>
-      </w:r>
-    </w:p>
-    <w:p>
-      <w:pPr>
-        <w:shd w:val="clear" w:color="auto" w:fill="F3F0FB"/>
-        <w:spacing w:line="276" w:lineRule="auto"/>
-        <w:ind w:left="200" w:right="200"/>
-      </w:pPr>
-      <w:r>
-        <w:rPr>
-          <w:rFonts w:ascii="Consolas" w:eastAsia="Consolas" w:hAnsi="Consolas" w:cs="Consolas"/>
-          <w:sz w:val="18"/>
-          <w:szCs w:val="18"/>
-        </w:rPr>
-        <w:t xml:space="preserve">    proxy_set_header Host $host;</w:t>
-      </w:r>
-    </w:p>
-    <w:p>
-      <w:pPr>
-        <w:shd w:val="clear" w:color="auto" w:fill="F3F0FB"/>
-        <w:spacing w:line="276" w:lineRule="auto"/>
-        <w:ind w:left="200" w:right="200"/>
-      </w:pPr>
-      <w:r>
-        <w:rPr>
-          <w:rFonts w:ascii="Consolas" w:eastAsia="Consolas" w:hAnsi="Consolas" w:cs="Consolas"/>
-          <w:sz w:val="18"/>
-          <w:szCs w:val="18"/>
-        </w:rPr>
-        <w:t xml:space="preserve">    proxy_set_header X-Forwarded-For $proxy_add_x_forwarded_for;</w:t>
-      </w:r>
-    </w:p>
-    <w:p>
-      <w:pPr>
-        <w:shd w:val="clear" w:color="auto" w:fill="F3F0FB"/>
-        <w:spacing w:line="276" w:lineRule="auto"/>
-        <w:ind w:left="200" w:right="200"/>
-      </w:pPr>
-      <w:r>
-        <w:rPr>
-          <w:rFonts w:ascii="Consolas" w:eastAsia="Consolas" w:hAnsi="Consolas" w:cs="Consolas"/>
-          <w:sz w:val="18"/>
-          <w:szCs w:val="18"/>
-        </w:rPr>
-        <w:t xml:space="preserve">    proxy_set_header X-Forwarded-Proto $scheme;</w:t>
-      </w:r>
-    </w:p>
-    <w:p>
-      <w:pPr>
-        <w:shd w:val="clear" w:color="auto" w:fill="F3F0FB"/>
-        <w:spacing w:line="276" w:lineRule="auto"/>
-        <w:ind w:left="200" w:right="200"/>
-      </w:pPr>
-      <w:r>
-        <w:rPr>
-          <w:rFonts w:ascii="Consolas" w:eastAsia="Consolas" w:hAnsi="Consolas" w:cs="Consolas"/>
-          <w:sz w:val="18"/>
-          <w:szCs w:val="18"/>
-        </w:rPr>
-        <w:t xml:space="preserve">    proxy_buffering off;      # required for SSE</w:t>
-      </w:r>
-    </w:p>
-    <w:p>
-      <w:pPr>
-        <w:shd w:val="clear" w:color="auto" w:fill="F3F0FB"/>
-        <w:spacing w:line="276" w:lineRule="auto"/>
-        <w:ind w:left="200" w:right="200"/>
-      </w:pPr>
-      <w:r>
-        <w:rPr>
-          <w:rFonts w:ascii="Consolas" w:eastAsia="Consolas" w:hAnsi="Consolas" w:cs="Consolas"/>
-          <w:sz w:val="18"/>
-          <w:szCs w:val="18"/>
-        </w:rPr>
-        <w:t xml:space="preserve">    proxy_read_timeout 300s;</w:t>
-      </w:r>
-    </w:p>
-    <w:p>
-      <w:pPr>
-        <w:shd w:val="clear" w:color="auto" w:fill="F3F0FB"/>
-        <w:spacing w:line="276" w:lineRule="auto"/>
-        <w:ind w:left="200" w:right="200"/>
-      </w:pPr>
-      <w:r>
-        <w:rPr>
-          <w:rFonts w:ascii="Consolas" w:eastAsia="Consolas" w:hAnsi="Consolas" w:cs="Consolas"/>
-          <w:sz w:val="18"/>
-          <w:szCs w:val="18"/>
-        </w:rPr>
-        <w:t>}</w:t>
-      </w:r>
-    </w:p>
-    <w:p>
-      <w:pPr>
-        <w:spacing w:after="120"/>
-      </w:pPr>
-    </w:p>
-    <w:p>
-      <w:pPr>
-        <w:pStyle w:val="Heading2"/>
-        <w:keepNext/>
-      </w:pPr>
-      <w:bookmarkStart w:id="29" w:name="_Toc241000393"/>
-      <w:r>
-        <w:t>6.3 Scaling, persistence and upgrades</w:t>
-      </w:r>
-      <w:bookmarkEnd w:id="29"/>
     </w:p>
     <w:p>
       <w:pPr>
@@ -9251,7 +9010,7 @@
         <w:spacing w:after="60"/>
       </w:pPr>
       <w:r>
-        <w:t xml:space="preserve">Run several </w:t>
+        <w:t xml:space="preserve">Set </w:t>
       </w:r>
       <w:r>
         <w:rPr>
@@ -9261,10 +9020,10 @@
           <w:szCs w:val="20"/>
           <w:shd w:val="clear" w:color="auto" w:fill="F6F4FF"/>
         </w:rPr>
-        <w:t>app</w:t>
-      </w:r>
-      <w:r>
-        <w:t xml:space="preserve"> replicas behind the proxy with Redis enabled; provider-config changes propagate within 30 s. Without Redis, keep a single replica.</w:t>
+        <w:t>APP_SECRET_KEY</w:t>
+      </w:r>
+      <w:r>
+        <w:t xml:space="preserve"> to a long random value and never change it afterwards (it encrypts stored credentials).</w:t>
       </w:r>
     </w:p>
     <w:p>
@@ -9277,46 +9036,7 @@
         <w:spacing w:after="60"/>
       </w:pPr>
       <w:r>
-        <w:t>Back up the Postgres volume (</w:t>
-      </w:r>
-      <w:r>
-        <w:rPr>
-          <w:rFonts w:ascii="Consolas" w:eastAsia="Consolas" w:hAnsi="Consolas" w:cs="Consolas"/>
-          <w:color w:val="442690"/>
-          <w:sz w:val="20"/>
-          <w:szCs w:val="20"/>
-          <w:shd w:val="clear" w:color="auto" w:fill="F6F4FF"/>
-        </w:rPr>
-        <w:t>pg_dump</w:t>
-      </w:r>
-      <w:r>
-        <w:t xml:space="preserve">) and the </w:t>
-      </w:r>
-      <w:r>
-        <w:rPr>
-          <w:rFonts w:ascii="Consolas" w:eastAsia="Consolas" w:hAnsi="Consolas" w:cs="Consolas"/>
-          <w:color w:val="442690"/>
-          <w:sz w:val="20"/>
-          <w:szCs w:val="20"/>
-          <w:shd w:val="clear" w:color="auto" w:fill="F6F4FF"/>
-        </w:rPr>
-        <w:t>/data</w:t>
-      </w:r>
-      <w:r>
-        <w:t xml:space="preserve"> volume (it holds the generated secret when </w:t>
-      </w:r>
-      <w:r>
-        <w:rPr>
-          <w:rFonts w:ascii="Consolas" w:eastAsia="Consolas" w:hAnsi="Consolas" w:cs="Consolas"/>
-          <w:color w:val="442690"/>
-          <w:sz w:val="20"/>
-          <w:szCs w:val="20"/>
-          <w:shd w:val="clear" w:color="auto" w:fill="F6F4FF"/>
-        </w:rPr>
-        <w:t>APP_SECRET_KEY</w:t>
-      </w:r>
-      <w:r>
-        <w:t xml:space="preserve"> is not set).</w:t>
+        <w:t>Change the admin password (Account → Change password).</w:t>
       </w:r>
     </w:p>
     <w:p>
@@ -9329,20 +9049,7 @@
         <w:spacing w:after="60"/>
       </w:pPr>
       <w:r>
-        <w:t xml:space="preserve">Upgrade with </w:t>
-      </w:r>
-      <w:r>
-        <w:rPr>
-          <w:rFonts w:ascii="Consolas" w:eastAsia="Consolas" w:hAnsi="Consolas" w:cs="Consolas"/>
-          <w:color w:val="442690"/>
-          <w:sz w:val="20"/>
-          <w:szCs w:val="20"/>
-          <w:shd w:val="clear" w:color="auto" w:fill="F6F4FF"/>
-        </w:rPr>
-        <w:t>git pull &amp;&amp; docker compose build app &amp;&amp; docker compose up -d</w:t>
-      </w:r>
-      <w:r>
-        <w:t>; schema migrations run automatically and are safe to run from multiple replicas.</w:t>
+        <w:t>Change the bundled Postgres password, or use your own Postgres.</w:t>
       </w:r>
     </w:p>
     <w:p>
@@ -9355,7 +9062,7 @@
         <w:spacing w:after="60"/>
       </w:pPr>
       <w:r>
-        <w:t xml:space="preserve">Usage rows are small but unbounded — prune </w:t>
+        <w:t xml:space="preserve">Serve over HTTPS behind a reverse proxy; the session cookie becomes </w:t>
       </w:r>
       <w:r>
         <w:rPr>
@@ -9365,10 +9072,49 @@
           <w:szCs w:val="20"/>
           <w:shd w:val="clear" w:color="auto" w:fill="F6F4FF"/>
         </w:rPr>
-        <w:t>usage_events</w:t>
-      </w:r>
-      <w:r>
-        <w:t xml:space="preserve"> periodically if traffic is heavy.</w:t>
+        <w:t>Secure</w:t>
+      </w:r>
+      <w:r>
+        <w:t xml:space="preserve"> automatically.</w:t>
+      </w:r>
+    </w:p>
+    <w:p>
+      <w:pPr>
+        <w:pStyle w:val="ListParagraph"/>
+        <w:numPr>
+          <w:ilvl w:val="0"/>
+          <w:numId w:val="4"/>
+        </w:numPr>
+        <w:spacing w:after="60"/>
+      </w:pPr>
+      <w:r>
+        <w:t xml:space="preserve">Restrict </w:t>
+      </w:r>
+      <w:r>
+        <w:rPr>
+          <w:rFonts w:ascii="Consolas" w:eastAsia="Consolas" w:hAnsi="Consolas" w:cs="Consolas"/>
+          <w:color w:val="442690"/>
+          <w:sz w:val="20"/>
+          <w:szCs w:val="20"/>
+          <w:shd w:val="clear" w:color="auto" w:fill="F6F4FF"/>
+        </w:rPr>
+        <w:t>CORS_ALLOW_ORIGINS</w:t>
+      </w:r>
+      <w:r>
+        <w:t xml:space="preserve"> if browsers call the API directly.</w:t>
+      </w:r>
+    </w:p>
+    <w:p>
+      <w:pPr>
+        <w:pStyle w:val="ListParagraph"/>
+        <w:numPr>
+          <w:ilvl w:val="0"/>
+          <w:numId w:val="4"/>
+        </w:numPr>
+        <w:spacing w:after="60"/>
+      </w:pPr>
+      <w:r>
+        <w:t>Keep Postgres and Redis on the private network — the compose file does not publish their ports.</w:t>
       </w:r>
     </w:p>
     <w:p>
@@ -9376,9 +9122,331 @@
         <w:pStyle w:val="Heading2"/>
         <w:keepNext/>
       </w:pPr>
-      <w:bookmarkStart w:id="30" w:name="_Toc241000394"/>
-      <w:r>
-        <w:lastRenderedPageBreak/>
+      <w:bookmarkStart w:id="28" w:name="_Toc241000501"/>
+      <w:r>
+        <w:t>6.2 Reverse proxy</w:t>
+      </w:r>
+      <w:bookmarkEnd w:id="28"/>
+    </w:p>
+    <w:p>
+      <w:pPr>
+        <w:spacing w:after="120"/>
+      </w:pPr>
+      <w:r>
+        <w:t xml:space="preserve">FareLens listens on plain HTTP (port 8000) and honours </w:t>
+      </w:r>
+      <w:r>
+        <w:rPr>
+          <w:rFonts w:ascii="Consolas" w:eastAsia="Consolas" w:hAnsi="Consolas" w:cs="Consolas"/>
+          <w:color w:val="442690"/>
+          <w:sz w:val="20"/>
+          <w:szCs w:val="20"/>
+          <w:shd w:val="clear" w:color="auto" w:fill="F6F4FF"/>
+        </w:rPr>
+        <w:t>X-Forwarded-*</w:t>
+      </w:r>
+      <w:r>
+        <w:t xml:space="preserve"> headers. Server-Sent Events require response buffering to be </w:t>
+      </w:r>
+      <w:r>
+        <w:rPr>
+          <w:b/>
+          <w:bCs/>
+        </w:rPr>
+        <w:t>off</w:t>
+      </w:r>
+      <w:r>
+        <w:t xml:space="preserve"> on every proxy in the path.</w:t>
+      </w:r>
+    </w:p>
+    <w:p>
+      <w:pPr>
+        <w:shd w:val="clear" w:color="auto" w:fill="F3F0FB"/>
+        <w:spacing w:line="276" w:lineRule="auto"/>
+        <w:ind w:left="200" w:right="200"/>
+      </w:pPr>
+      <w:r>
+        <w:rPr>
+          <w:rFonts w:ascii="Consolas" w:eastAsia="Consolas" w:hAnsi="Consolas" w:cs="Consolas"/>
+          <w:sz w:val="18"/>
+          <w:szCs w:val="18"/>
+        </w:rPr>
+        <w:t># nginx</w:t>
+      </w:r>
+    </w:p>
+    <w:p>
+      <w:pPr>
+        <w:shd w:val="clear" w:color="auto" w:fill="F3F0FB"/>
+        <w:spacing w:line="276" w:lineRule="auto"/>
+        <w:ind w:left="200" w:right="200"/>
+      </w:pPr>
+      <w:r>
+        <w:rPr>
+          <w:rFonts w:ascii="Consolas" w:eastAsia="Consolas" w:hAnsi="Consolas" w:cs="Consolas"/>
+          <w:sz w:val="18"/>
+          <w:szCs w:val="18"/>
+        </w:rPr>
+        <w:t>location / {</w:t>
+      </w:r>
+    </w:p>
+    <w:p>
+      <w:pPr>
+        <w:shd w:val="clear" w:color="auto" w:fill="F3F0FB"/>
+        <w:spacing w:line="276" w:lineRule="auto"/>
+        <w:ind w:left="200" w:right="200"/>
+      </w:pPr>
+      <w:r>
+        <w:rPr>
+          <w:rFonts w:ascii="Consolas" w:eastAsia="Consolas" w:hAnsi="Consolas" w:cs="Consolas"/>
+          <w:sz w:val="18"/>
+          <w:szCs w:val="18"/>
+        </w:rPr>
+        <w:t xml:space="preserve">    proxy_pass http://127.0.0.1:8000;</w:t>
+      </w:r>
+    </w:p>
+    <w:p>
+      <w:pPr>
+        <w:shd w:val="clear" w:color="auto" w:fill="F3F0FB"/>
+        <w:spacing w:line="276" w:lineRule="auto"/>
+        <w:ind w:left="200" w:right="200"/>
+      </w:pPr>
+      <w:r>
+        <w:rPr>
+          <w:rFonts w:ascii="Consolas" w:eastAsia="Consolas" w:hAnsi="Consolas" w:cs="Consolas"/>
+          <w:sz w:val="18"/>
+          <w:szCs w:val="18"/>
+        </w:rPr>
+        <w:t xml:space="preserve">    proxy_set_header Host $host;</w:t>
+      </w:r>
+    </w:p>
+    <w:p>
+      <w:pPr>
+        <w:shd w:val="clear" w:color="auto" w:fill="F3F0FB"/>
+        <w:spacing w:line="276" w:lineRule="auto"/>
+        <w:ind w:left="200" w:right="200"/>
+      </w:pPr>
+      <w:r>
+        <w:rPr>
+          <w:rFonts w:ascii="Consolas" w:eastAsia="Consolas" w:hAnsi="Consolas" w:cs="Consolas"/>
+          <w:sz w:val="18"/>
+          <w:szCs w:val="18"/>
+        </w:rPr>
+        <w:t xml:space="preserve">    proxy_set_header X-Forwarded-For $proxy_add_x_forwarded_for;</w:t>
+      </w:r>
+    </w:p>
+    <w:p>
+      <w:pPr>
+        <w:shd w:val="clear" w:color="auto" w:fill="F3F0FB"/>
+        <w:spacing w:line="276" w:lineRule="auto"/>
+        <w:ind w:left="200" w:right="200"/>
+      </w:pPr>
+      <w:r>
+        <w:rPr>
+          <w:rFonts w:ascii="Consolas" w:eastAsia="Consolas" w:hAnsi="Consolas" w:cs="Consolas"/>
+          <w:sz w:val="18"/>
+          <w:szCs w:val="18"/>
+        </w:rPr>
+        <w:t xml:space="preserve">    proxy_set_header X-Forwarded-Proto $scheme;</w:t>
+      </w:r>
+    </w:p>
+    <w:p>
+      <w:pPr>
+        <w:shd w:val="clear" w:color="auto" w:fill="F3F0FB"/>
+        <w:spacing w:line="276" w:lineRule="auto"/>
+        <w:ind w:left="200" w:right="200"/>
+      </w:pPr>
+      <w:r>
+        <w:rPr>
+          <w:rFonts w:ascii="Consolas" w:eastAsia="Consolas" w:hAnsi="Consolas" w:cs="Consolas"/>
+          <w:sz w:val="18"/>
+          <w:szCs w:val="18"/>
+        </w:rPr>
+        <w:t xml:space="preserve">    proxy_buffering off;      # required for SSE</w:t>
+      </w:r>
+    </w:p>
+    <w:p>
+      <w:pPr>
+        <w:shd w:val="clear" w:color="auto" w:fill="F3F0FB"/>
+        <w:spacing w:line="276" w:lineRule="auto"/>
+        <w:ind w:left="200" w:right="200"/>
+      </w:pPr>
+      <w:r>
+        <w:rPr>
+          <w:rFonts w:ascii="Consolas" w:eastAsia="Consolas" w:hAnsi="Consolas" w:cs="Consolas"/>
+          <w:sz w:val="18"/>
+          <w:szCs w:val="18"/>
+        </w:rPr>
+        <w:t xml:space="preserve">    proxy_read_timeout 300s;</w:t>
+      </w:r>
+    </w:p>
+    <w:p>
+      <w:pPr>
+        <w:shd w:val="clear" w:color="auto" w:fill="F3F0FB"/>
+        <w:spacing w:line="276" w:lineRule="auto"/>
+        <w:ind w:left="200" w:right="200"/>
+      </w:pPr>
+      <w:r>
+        <w:rPr>
+          <w:rFonts w:ascii="Consolas" w:eastAsia="Consolas" w:hAnsi="Consolas" w:cs="Consolas"/>
+          <w:sz w:val="18"/>
+          <w:szCs w:val="18"/>
+        </w:rPr>
+        <w:t>}</w:t>
+      </w:r>
+    </w:p>
+    <w:p>
+      <w:pPr>
+        <w:spacing w:after="120"/>
+      </w:pPr>
+    </w:p>
+    <w:p>
+      <w:pPr>
+        <w:pStyle w:val="Heading2"/>
+        <w:keepNext/>
+      </w:pPr>
+      <w:bookmarkStart w:id="29" w:name="_Toc241000502"/>
+      <w:r>
+        <w:t>6.3 Scaling, persistence and upgrades</w:t>
+      </w:r>
+      <w:bookmarkEnd w:id="29"/>
+    </w:p>
+    <w:p>
+      <w:pPr>
+        <w:pStyle w:val="ListParagraph"/>
+        <w:numPr>
+          <w:ilvl w:val="0"/>
+          <w:numId w:val="2"/>
+        </w:numPr>
+        <w:spacing w:after="60"/>
+      </w:pPr>
+      <w:r>
+        <w:t xml:space="preserve">Run several </w:t>
+      </w:r>
+      <w:r>
+        <w:rPr>
+          <w:rFonts w:ascii="Consolas" w:eastAsia="Consolas" w:hAnsi="Consolas" w:cs="Consolas"/>
+          <w:color w:val="442690"/>
+          <w:sz w:val="20"/>
+          <w:szCs w:val="20"/>
+          <w:shd w:val="clear" w:color="auto" w:fill="F6F4FF"/>
+        </w:rPr>
+        <w:t>app</w:t>
+      </w:r>
+      <w:r>
+        <w:t xml:space="preserve"> replicas behind the proxy with Redis enabled; provider-config changes propagate within 30 s. Without Redis, keep a single replica.</w:t>
+      </w:r>
+    </w:p>
+    <w:p>
+      <w:pPr>
+        <w:pStyle w:val="ListParagraph"/>
+        <w:numPr>
+          <w:ilvl w:val="0"/>
+          <w:numId w:val="2"/>
+        </w:numPr>
+        <w:spacing w:after="60"/>
+      </w:pPr>
+      <w:r>
+        <w:t>Back up the Postgres volume (</w:t>
+      </w:r>
+      <w:r>
+        <w:rPr>
+          <w:rFonts w:ascii="Consolas" w:eastAsia="Consolas" w:hAnsi="Consolas" w:cs="Consolas"/>
+          <w:color w:val="442690"/>
+          <w:sz w:val="20"/>
+          <w:szCs w:val="20"/>
+          <w:shd w:val="clear" w:color="auto" w:fill="F6F4FF"/>
+        </w:rPr>
+        <w:t>pg_dump</w:t>
+      </w:r>
+      <w:r>
+        <w:t xml:space="preserve">) and the </w:t>
+      </w:r>
+      <w:r>
+        <w:rPr>
+          <w:rFonts w:ascii="Consolas" w:eastAsia="Consolas" w:hAnsi="Consolas" w:cs="Consolas"/>
+          <w:color w:val="442690"/>
+          <w:sz w:val="20"/>
+          <w:szCs w:val="20"/>
+          <w:shd w:val="clear" w:color="auto" w:fill="F6F4FF"/>
+        </w:rPr>
+        <w:t>/data</w:t>
+      </w:r>
+      <w:r>
+        <w:t xml:space="preserve"> volume (it holds the generated secret when </w:t>
+      </w:r>
+      <w:r>
+        <w:rPr>
+          <w:rFonts w:ascii="Consolas" w:eastAsia="Consolas" w:hAnsi="Consolas" w:cs="Consolas"/>
+          <w:color w:val="442690"/>
+          <w:sz w:val="20"/>
+          <w:szCs w:val="20"/>
+          <w:shd w:val="clear" w:color="auto" w:fill="F6F4FF"/>
+        </w:rPr>
+        <w:t>APP_SECRET_KEY</w:t>
+      </w:r>
+      <w:r>
+        <w:t xml:space="preserve"> is not set).</w:t>
+      </w:r>
+    </w:p>
+    <w:p>
+      <w:pPr>
+        <w:pStyle w:val="ListParagraph"/>
+        <w:numPr>
+          <w:ilvl w:val="0"/>
+          <w:numId w:val="2"/>
+        </w:numPr>
+        <w:spacing w:after="60"/>
+      </w:pPr>
+      <w:r>
+        <w:t xml:space="preserve">Upgrade with </w:t>
+      </w:r>
+      <w:r>
+        <w:rPr>
+          <w:rFonts w:ascii="Consolas" w:eastAsia="Consolas" w:hAnsi="Consolas" w:cs="Consolas"/>
+          <w:color w:val="442690"/>
+          <w:sz w:val="20"/>
+          <w:szCs w:val="20"/>
+          <w:shd w:val="clear" w:color="auto" w:fill="F6F4FF"/>
+        </w:rPr>
+        <w:t>git pull &amp;&amp; docker compose build app &amp;&amp; docker compose up -d</w:t>
+      </w:r>
+      <w:r>
+        <w:t>; schema migrations run automatically and are safe to run from multiple replicas.</w:t>
+      </w:r>
+    </w:p>
+    <w:p>
+      <w:pPr>
+        <w:pStyle w:val="ListParagraph"/>
+        <w:numPr>
+          <w:ilvl w:val="0"/>
+          <w:numId w:val="2"/>
+        </w:numPr>
+        <w:spacing w:after="60"/>
+      </w:pPr>
+      <w:r>
+        <w:t xml:space="preserve">Usage rows are small but unbounded — prune </w:t>
+      </w:r>
+      <w:r>
+        <w:rPr>
+          <w:rFonts w:ascii="Consolas" w:eastAsia="Consolas" w:hAnsi="Consolas" w:cs="Consolas"/>
+          <w:color w:val="442690"/>
+          <w:sz w:val="20"/>
+          <w:szCs w:val="20"/>
+          <w:shd w:val="clear" w:color="auto" w:fill="F6F4FF"/>
+        </w:rPr>
+        <w:t>usage_events</w:t>
+      </w:r>
+      <w:r>
+        <w:t xml:space="preserve"> periodically if traffic is heavy.</w:t>
+      </w:r>
+    </w:p>
+    <w:p>
+      <w:pPr>
+        <w:pStyle w:val="Heading2"/>
+        <w:keepNext/>
+      </w:pPr>
+      <w:bookmarkStart w:id="30" w:name="_Toc241000503"/>
+      <w:r>
         <w:t>6.4 What FareLens stores</w:t>
       </w:r>
       <w:bookmarkEnd w:id="30"/>
@@ -10128,9 +10196,8 @@
         <w:keepNext/>
         <w:pageBreakBefore/>
       </w:pPr>
-      <w:bookmarkStart w:id="31" w:name="_Toc241000395"/>
-      <w:r>
-        <w:lastRenderedPageBreak/>
+      <w:bookmarkStart w:id="31" w:name="_Toc241000504"/>
+      <w:r>
         <w:t>7. Contributing, credits and license</w:t>
       </w:r>
       <w:bookmarkEnd w:id="31"/>
@@ -10431,96 +10498,64 @@
 <file path=word/numbering.xml><?xml version="1.0" encoding="utf-8"?>
 <w:numbering xmlns:wpc="http://schemas.microsoft.com/office/word/2010/wordprocessingCanvas" xmlns:cx="http://schemas.microsoft.com/office/drawing/2014/chartex" xmlns:cx1="http://schemas.microsoft.com/office/drawing/2015/9/8/chartex" xmlns:cx2="http://schemas.microsoft.com/office/drawing/2015/10/21/chartex" xmlns:cx3="http://schemas.microsoft.com/office/drawing/2016/5/9/chartex" xmlns:cx4="http://schemas.microsoft.com/office/drawing/2016/5/10/chartex" xmlns:cx5="http://schemas.microsoft.com/office/drawing/2016/5/11/chartex" xmlns:cx6="http://schemas.microsoft.com/office/drawing/2016/5/12/chartex" xmlns:cx7="http://schemas.microsoft.com/office/drawing/2016/5/13/chartex" xmlns:cx8="http://schemas.microsoft.com/office/drawing/2016/5/14/chartex" xmlns:mc="http://schemas.openxmlformats.org/markup-compatibility/2006" xmlns:aink="http://schemas.microsoft.com/office/drawing/2016/ink" xmlns:am3d="http://schemas.microsoft.com/office/drawing/2017/model3d" xmlns:o="urn:schemas-microsoft-com:office:office" xmlns:oel="http://schemas.microsoft.com/office/2019/extlst" xmlns:r="http://schemas.openxmlformats.org/officeDocument/2006/relationships" xmlns:m="http://schemas.openxmlformats.org/officeDocument/2006/math" xmlns:v="urn:schemas-microsoft-com:vml" xmlns:wp14="http://schemas.microsoft.com/office/word/2010/wordprocessingDrawing" xmlns:wp="http://schemas.openxmlformats.org/drawingml/2006/wordprocessingDrawing" xmlns:w10="urn:schemas-microsoft-com:office:word" xmlns:w="http://schemas.openxmlformats.org/wordprocessingml/2006/main" xmlns:w14="http://schemas.microsoft.com/office/word/2010/wordml" xmlns:w15="http://schemas.microsoft.com/office/word/2012/wordml" xmlns:w16cex="http://schemas.microsoft.com/office/word/2018/wordml/cex" xmlns:w16cid="http://schemas.microsoft.com/office/word/2016/wordml/cid" xmlns:w16="http://schemas.microsoft.com/office/word/2018/wordml" xmlns:w16du="http://schemas.microsoft.com/office/word/2023/wordml/word16du" xmlns:w16sdtdh="http://schemas.microsoft.com/office/word/2020/wordml/sdtdatahash" xmlns:w16sdtfl="http://schemas.microsoft.com/office/word/2024/wordml/sdtformatlock" xmlns:w16se="http://schemas.microsoft.com/office/word/2015/wordml/symex" xmlns:wpg="http://schemas.microsoft.com/office/word/2010/wordprocessingGroup" xmlns:wpi="http://schemas.microsoft.com/office/word/2010/wordprocessingInk" xmlns:wne="http://schemas.microsoft.com/office/word/2006/wordml" xmlns:wps="http://schemas.microsoft.com/office/word/2010/wordprocessingShape" mc:Ignorable="w14 w15 w16se w16cid w16 w16cex w16sdtdh w16sdtfl w16du wp14">
   <w:abstractNum w:abstractNumId="0" w15:restartNumberingAfterBreak="0">
-    <w:nsid w:val="3B8A56C2"/>
+    <w:nsid w:val="22B711E7"/>
     <w:multiLevelType w:val="hybridMultilevel"/>
-    <w:tmpl w:val="33082562"/>
-    <w:lvl w:ilvl="0" w:tplc="7A126628">
+    <w:tmpl w:val="1220AB18"/>
+    <w:lvl w:ilvl="0" w:tplc="3F8A1620">
       <w:start w:val="1"/>
       <w:numFmt w:val="bullet"/>
-      <w:lvlText w:val="●"/>
+      <w:lvlText w:val="•"/>
       <w:lvlJc w:val="left"/>
       <w:pPr>
-        <w:ind w:left="720" w:hanging="360"/>
+        <w:ind w:left="540" w:hanging="270"/>
       </w:pPr>
     </w:lvl>
-    <w:lvl w:ilvl="1" w:tplc="637AA1EC">
-      <w:start w:val="1"/>
-      <w:numFmt w:val="bullet"/>
-      <w:lvlText w:val="○"/>
+    <w:lvl w:ilvl="1" w:tplc="0D523F20">
+      <w:numFmt w:val="decimal"/>
+      <w:lvlText w:val=""/>
       <w:lvlJc w:val="left"/>
-      <w:pPr>
-        <w:ind w:left="1440" w:hanging="360"/>
-      </w:pPr>
     </w:lvl>
-    <w:lvl w:ilvl="2" w:tplc="42E47ECA">
-      <w:start w:val="1"/>
-      <w:numFmt w:val="bullet"/>
-      <w:lvlText w:val="■"/>
+    <w:lvl w:ilvl="2" w:tplc="43E88B1A">
+      <w:numFmt w:val="decimal"/>
+      <w:lvlText w:val=""/>
       <w:lvlJc w:val="left"/>
-      <w:pPr>
-        <w:ind w:left="2160" w:hanging="360"/>
-      </w:pPr>
     </w:lvl>
-    <w:lvl w:ilvl="3" w:tplc="9FC6FF08">
-      <w:start w:val="1"/>
-      <w:numFmt w:val="bullet"/>
-      <w:lvlText w:val="●"/>
+    <w:lvl w:ilvl="3" w:tplc="FB78B93A">
+      <w:numFmt w:val="decimal"/>
+      <w:lvlText w:val=""/>
       <w:lvlJc w:val="left"/>
-      <w:pPr>
-        <w:ind w:left="2880" w:hanging="360"/>
-      </w:pPr>
     </w:lvl>
-    <w:lvl w:ilvl="4" w:tplc="66345190">
-      <w:start w:val="1"/>
-      <w:numFmt w:val="bullet"/>
-      <w:lvlText w:val="○"/>
+    <w:lvl w:ilvl="4" w:tplc="895C2880">
+      <w:numFmt w:val="decimal"/>
+      <w:lvlText w:val=""/>
       <w:lvlJc w:val="left"/>
-      <w:pPr>
-        <w:ind w:left="3600" w:hanging="360"/>
-      </w:pPr>
     </w:lvl>
-    <w:lvl w:ilvl="5" w:tplc="7A7C8864">
-      <w:start w:val="1"/>
-      <w:numFmt w:val="bullet"/>
-      <w:lvlText w:val="■"/>
+    <w:lvl w:ilvl="5" w:tplc="2E106180">
+      <w:numFmt w:val="decimal"/>
+      <w:lvlText w:val=""/>
       <w:lvlJc w:val="left"/>
-      <w:pPr>
-        <w:ind w:left="4320" w:hanging="360"/>
-      </w:pPr>
     </w:lvl>
-    <w:lvl w:ilvl="6" w:tplc="CCB83130">
-      <w:start w:val="1"/>
-      <w:numFmt w:val="bullet"/>
-      <w:lvlText w:val="●"/>
+    <w:lvl w:ilvl="6" w:tplc="E6722C40">
+      <w:numFmt w:val="decimal"/>
+      <w:lvlText w:val=""/>
       <w:lvlJc w:val="left"/>
-      <w:pPr>
-        <w:ind w:left="5040" w:hanging="360"/>
-      </w:pPr>
     </w:lvl>
-    <w:lvl w:ilvl="7" w:tplc="5E08C406">
-      <w:start w:val="1"/>
-      <w:numFmt w:val="bullet"/>
-      <w:lvlText w:val="●"/>
+    <w:lvl w:ilvl="7" w:tplc="05443F7E">
+      <w:numFmt w:val="decimal"/>
+      <w:lvlText w:val=""/>
       <w:lvlJc w:val="left"/>
-      <w:pPr>
-        <w:ind w:left="5760" w:hanging="360"/>
-      </w:pPr>
     </w:lvl>
-    <w:lvl w:ilvl="8" w:tplc="B2C84F1C">
-      <w:start w:val="1"/>
-      <w:numFmt w:val="bullet"/>
-      <w:lvlText w:val="●"/>
+    <w:lvl w:ilvl="8" w:tplc="36DAA65C">
+      <w:numFmt w:val="decimal"/>
+      <w:lvlText w:val=""/>
       <w:lvlJc w:val="left"/>
-      <w:pPr>
-        <w:ind w:left="6480" w:hanging="360"/>
-      </w:pPr>
     </w:lvl>
   </w:abstractNum>
   <w:abstractNum w:abstractNumId="1" w15:restartNumberingAfterBreak="0">
-    <w:nsid w:val="4081467E"/>
+    <w:nsid w:val="4D300138"/>
     <w:multiLevelType w:val="hybridMultilevel"/>
-    <w:tmpl w:val="3154C39E"/>
-    <w:lvl w:ilvl="0" w:tplc="064AC466">
+    <w:tmpl w:val="FA3C74D8"/>
+    <w:lvl w:ilvl="0" w:tplc="E502044E">
       <w:start w:val="1"/>
       <w:numFmt w:val="decimal"/>
       <w:lvlText w:val="%1."/>
@@ -10529,52 +10564,52 @@
         <w:ind w:left="540" w:hanging="360"/>
       </w:pPr>
     </w:lvl>
-    <w:lvl w:ilvl="1" w:tplc="3604800C">
+    <w:lvl w:ilvl="1" w:tplc="9AF6438A">
       <w:numFmt w:val="decimal"/>
       <w:lvlText w:val=""/>
       <w:lvlJc w:val="left"/>
     </w:lvl>
-    <w:lvl w:ilvl="2" w:tplc="E19813D6">
+    <w:lvl w:ilvl="2" w:tplc="98EADA34">
       <w:numFmt w:val="decimal"/>
       <w:lvlText w:val=""/>
       <w:lvlJc w:val="left"/>
     </w:lvl>
-    <w:lvl w:ilvl="3" w:tplc="4DDAF410">
+    <w:lvl w:ilvl="3" w:tplc="A844D7D8">
       <w:numFmt w:val="decimal"/>
       <w:lvlText w:val=""/>
       <w:lvlJc w:val="left"/>
     </w:lvl>
-    <w:lvl w:ilvl="4" w:tplc="B76AF0F8">
+    <w:lvl w:ilvl="4" w:tplc="1F8E140C">
       <w:numFmt w:val="decimal"/>
       <w:lvlText w:val=""/>
       <w:lvlJc w:val="left"/>
     </w:lvl>
-    <w:lvl w:ilvl="5" w:tplc="FE8CFC28">
+    <w:lvl w:ilvl="5" w:tplc="8F0E9752">
       <w:numFmt w:val="decimal"/>
       <w:lvlText w:val=""/>
       <w:lvlJc w:val="left"/>
     </w:lvl>
-    <w:lvl w:ilvl="6" w:tplc="4B4E721C">
+    <w:lvl w:ilvl="6" w:tplc="9DF42A84">
       <w:numFmt w:val="decimal"/>
       <w:lvlText w:val=""/>
       <w:lvlJc w:val="left"/>
     </w:lvl>
-    <w:lvl w:ilvl="7" w:tplc="1CCC4254">
+    <w:lvl w:ilvl="7" w:tplc="6692445A">
       <w:numFmt w:val="decimal"/>
       <w:lvlText w:val=""/>
       <w:lvlJc w:val="left"/>
     </w:lvl>
-    <w:lvl w:ilvl="8" w:tplc="23889EB6">
+    <w:lvl w:ilvl="8" w:tplc="83DAE076">
       <w:numFmt w:val="decimal"/>
       <w:lvlText w:val=""/>
       <w:lvlJc w:val="left"/>
     </w:lvl>
   </w:abstractNum>
   <w:abstractNum w:abstractNumId="2" w15:restartNumberingAfterBreak="0">
-    <w:nsid w:val="5C557723"/>
+    <w:nsid w:val="610537E9"/>
     <w:multiLevelType w:val="hybridMultilevel"/>
-    <w:tmpl w:val="879628DE"/>
-    <w:lvl w:ilvl="0" w:tplc="2AD80D60">
+    <w:tmpl w:val="36EC70AA"/>
+    <w:lvl w:ilvl="0" w:tplc="B0C278EA">
       <w:start w:val="1"/>
       <w:numFmt w:val="bullet"/>
       <w:lvlText w:val="☐"/>
@@ -10583,121 +10618,153 @@
         <w:ind w:left="540" w:hanging="320"/>
       </w:pPr>
     </w:lvl>
-    <w:lvl w:ilvl="1" w:tplc="8772941A">
+    <w:lvl w:ilvl="1" w:tplc="0DD61346">
       <w:numFmt w:val="decimal"/>
       <w:lvlText w:val=""/>
       <w:lvlJc w:val="left"/>
     </w:lvl>
-    <w:lvl w:ilvl="2" w:tplc="4A368B2E">
+    <w:lvl w:ilvl="2" w:tplc="DF3472D8">
       <w:numFmt w:val="decimal"/>
       <w:lvlText w:val=""/>
       <w:lvlJc w:val="left"/>
     </w:lvl>
-    <w:lvl w:ilvl="3" w:tplc="F3489D68">
+    <w:lvl w:ilvl="3" w:tplc="5E1A935C">
       <w:numFmt w:val="decimal"/>
       <w:lvlText w:val=""/>
       <w:lvlJc w:val="left"/>
     </w:lvl>
-    <w:lvl w:ilvl="4" w:tplc="1DE0971C">
+    <w:lvl w:ilvl="4" w:tplc="DD8E21C4">
       <w:numFmt w:val="decimal"/>
       <w:lvlText w:val=""/>
       <w:lvlJc w:val="left"/>
     </w:lvl>
-    <w:lvl w:ilvl="5" w:tplc="93CC651E">
+    <w:lvl w:ilvl="5" w:tplc="A9441DC6">
       <w:numFmt w:val="decimal"/>
       <w:lvlText w:val=""/>
       <w:lvlJc w:val="left"/>
     </w:lvl>
-    <w:lvl w:ilvl="6" w:tplc="CAFCC316">
+    <w:lvl w:ilvl="6" w:tplc="96A81034">
       <w:numFmt w:val="decimal"/>
       <w:lvlText w:val=""/>
       <w:lvlJc w:val="left"/>
     </w:lvl>
-    <w:lvl w:ilvl="7" w:tplc="D1924552">
+    <w:lvl w:ilvl="7" w:tplc="11E62028">
       <w:numFmt w:val="decimal"/>
       <w:lvlText w:val=""/>
       <w:lvlJc w:val="left"/>
     </w:lvl>
-    <w:lvl w:ilvl="8" w:tplc="D0026660">
+    <w:lvl w:ilvl="8" w:tplc="F9783CA8">
       <w:numFmt w:val="decimal"/>
       <w:lvlText w:val=""/>
       <w:lvlJc w:val="left"/>
     </w:lvl>
   </w:abstractNum>
   <w:abstractNum w:abstractNumId="3" w15:restartNumberingAfterBreak="0">
-    <w:nsid w:val="61BD5394"/>
+    <w:nsid w:val="7E891FA0"/>
     <w:multiLevelType w:val="hybridMultilevel"/>
-    <w:tmpl w:val="341C6716"/>
-    <w:lvl w:ilvl="0" w:tplc="0F6889AE">
+    <w:tmpl w:val="33A6EC02"/>
+    <w:lvl w:ilvl="0" w:tplc="BD781FC0">
       <w:start w:val="1"/>
       <w:numFmt w:val="bullet"/>
-      <w:lvlText w:val="•"/>
+      <w:lvlText w:val="●"/>
       <w:lvlJc w:val="left"/>
       <w:pPr>
-        <w:ind w:left="540" w:hanging="270"/>
+        <w:ind w:left="720" w:hanging="360"/>
       </w:pPr>
     </w:lvl>
-    <w:lvl w:ilvl="1" w:tplc="469A119A">
-      <w:numFmt w:val="decimal"/>
-      <w:lvlText w:val=""/>
+    <w:lvl w:ilvl="1" w:tplc="4C527ACE">
+      <w:start w:val="1"/>
+      <w:numFmt w:val="bullet"/>
+      <w:lvlText w:val="○"/>
       <w:lvlJc w:val="left"/>
+      <w:pPr>
+        <w:ind w:left="1440" w:hanging="360"/>
+      </w:pPr>
     </w:lvl>
-    <w:lvl w:ilvl="2" w:tplc="BE289510">
-      <w:numFmt w:val="decimal"/>
-      <w:lvlText w:val=""/>
+    <w:lvl w:ilvl="2" w:tplc="8C46FB60">
+      <w:start w:val="1"/>
+      <w:numFmt w:val="bullet"/>
+      <w:lvlText w:val="■"/>
       <w:lvlJc w:val="left"/>
+      <w:pPr>
+        <w:ind w:left="2160" w:hanging="360"/>
+      </w:pPr>
     </w:lvl>
-    <w:lvl w:ilvl="3" w:tplc="2BB40618">
-      <w:numFmt w:val="decimal"/>
-      <w:lvlText w:val=""/>
+    <w:lvl w:ilvl="3" w:tplc="17021332">
+      <w:start w:val="1"/>
+      <w:numFmt w:val="bullet"/>
+      <w:lvlText w:val="●"/>
       <w:lvlJc w:val="left"/>
+      <w:pPr>
+        <w:ind w:left="2880" w:hanging="360"/>
+      </w:pPr>
     </w:lvl>
-    <w:lvl w:ilvl="4" w:tplc="2E7EE7B4">
-      <w:numFmt w:val="decimal"/>
-      <w:lvlText w:val=""/>
+    <w:lvl w:ilvl="4" w:tplc="B796AE22">
+      <w:start w:val="1"/>
+      <w:numFmt w:val="bullet"/>
+      <w:lvlText w:val="○"/>
       <w:lvlJc w:val="left"/>
+      <w:pPr>
+        <w:ind w:left="3600" w:hanging="360"/>
+      </w:pPr>
     </w:lvl>
-    <w:lvl w:ilvl="5" w:tplc="8FC05C20">
-      <w:numFmt w:val="decimal"/>
-      <w:lvlText w:val=""/>
+    <w:lvl w:ilvl="5" w:tplc="FCC2215A">
+      <w:start w:val="1"/>
+      <w:numFmt w:val="bullet"/>
+      <w:lvlText w:val="■"/>
       <w:lvlJc w:val="left"/>
+      <w:pPr>
+        <w:ind w:left="4320" w:hanging="360"/>
+      </w:pPr>
     </w:lvl>
-    <w:lvl w:ilvl="6" w:tplc="8F948544">
-      <w:numFmt w:val="decimal"/>
-      <w:lvlText w:val=""/>
+    <w:lvl w:ilvl="6" w:tplc="E256AFA2">
+      <w:start w:val="1"/>
+      <w:numFmt w:val="bullet"/>
+      <w:lvlText w:val="●"/>
       <w:lvlJc w:val="left"/>
+      <w:pPr>
+        <w:ind w:left="5040" w:hanging="360"/>
+      </w:pPr>
     </w:lvl>
-    <w:lvl w:ilvl="7" w:tplc="EDFC95A8">
-      <w:numFmt w:val="decimal"/>
-      <w:lvlText w:val=""/>
+    <w:lvl w:ilvl="7" w:tplc="77C2D3A6">
+      <w:start w:val="1"/>
+      <w:numFmt w:val="bullet"/>
+      <w:lvlText w:val="●"/>
       <w:lvlJc w:val="left"/>
+      <w:pPr>
+        <w:ind w:left="5760" w:hanging="360"/>
+      </w:pPr>
     </w:lvl>
-    <w:lvl w:ilvl="8" w:tplc="F836DB94">
-      <w:numFmt w:val="decimal"/>
-      <w:lvlText w:val=""/>
+    <w:lvl w:ilvl="8" w:tplc="0B087C62">
+      <w:start w:val="1"/>
+      <w:numFmt w:val="bullet"/>
+      <w:lvlText w:val="●"/>
       <w:lvlJc w:val="left"/>
+      <w:pPr>
+        <w:ind w:left="6480" w:hanging="360"/>
+      </w:pPr>
     </w:lvl>
   </w:abstractNum>
-  <w:num w:numId="1" w16cid:durableId="1244341211">
+  <w:num w:numId="1" w16cid:durableId="1940062214">
+    <w:abstractNumId w:val="3"/>
+    <w:lvlOverride w:ilvl="0">
+      <w:startOverride w:val="1"/>
+    </w:lvlOverride>
+  </w:num>
+  <w:num w:numId="2" w16cid:durableId="1658722242">
     <w:abstractNumId w:val="0"/>
     <w:lvlOverride w:ilvl="0">
       <w:startOverride w:val="1"/>
     </w:lvlOverride>
   </w:num>
-  <w:num w:numId="2" w16cid:durableId="1370490977">
+  <w:num w:numId="3" w16cid:durableId="1290626799">
     <w:abstractNumId w:val="1"/>
     <w:lvlOverride w:ilvl="0">
       <w:startOverride w:val="1"/>
     </w:lvlOverride>
   </w:num>
-  <w:num w:numId="3" w16cid:durableId="1259875077">
+  <w:num w:numId="4" w16cid:durableId="840311099">
     <w:abstractNumId w:val="2"/>
-    <w:lvlOverride w:ilvl="0">
-      <w:startOverride w:val="1"/>
-    </w:lvlOverride>
-  </w:num>
-  <w:num w:numId="4" w16cid:durableId="1866557861">
-    <w:abstractNumId w:val="3"/>
     <w:lvlOverride w:ilvl="0">
       <w:startOverride w:val="1"/>
     </w:lvlOverride>
@@ -11317,7 +11384,7 @@
     <w:autoRedefine/>
     <w:uiPriority w:val="39"/>
     <w:unhideWhenUsed/>
-    <w:rsid w:val="008F5842"/>
+    <w:rsid w:val="005C6CB1"/>
     <w:pPr>
       <w:spacing w:after="100"/>
     </w:pPr>
@@ -11329,7 +11396,7 @@
     <w:autoRedefine/>
     <w:uiPriority w:val="39"/>
     <w:unhideWhenUsed/>
-    <w:rsid w:val="008F5842"/>
+    <w:rsid w:val="005C6CB1"/>
     <w:pPr>
       <w:spacing w:after="100"/>
       <w:ind w:left="210"/>

</xml_diff>